<commit_message>
Atualizado regras de negócio
</commit_message>
<xml_diff>
--- a/docs/requisitos/TCC - Urbanly.docx
+++ b/docs/requisitos/TCC - Urbanly.docx
@@ -1,6 +1,6 @@
 
 <file path=word/document.xml><?xml version="1.0" encoding="utf-8"?>
-<w:document xmlns:wpc="http://schemas.microsoft.com/office/word/2010/wordprocessingCanvas" xmlns:cx="http://schemas.microsoft.com/office/drawing/2014/chartex" xmlns:cx1="http://schemas.microsoft.com/office/drawing/2015/9/8/chartex" xmlns:cx2="http://schemas.microsoft.com/office/drawing/2015/10/21/chartex" xmlns:cx3="http://schemas.microsoft.com/office/drawing/2016/5/9/chartex" xmlns:cx4="http://schemas.microsoft.com/office/drawing/2016/5/10/chartex" xmlns:cx5="http://schemas.microsoft.com/office/drawing/2016/5/11/chartex" xmlns:cx6="http://schemas.microsoft.com/office/drawing/2016/5/12/chartex" xmlns:cx7="http://schemas.microsoft.com/office/drawing/2016/5/13/chartex" xmlns:cx8="http://schemas.microsoft.com/office/drawing/2016/5/14/chartex" xmlns:mc="http://schemas.openxmlformats.org/markup-compatibility/2006" xmlns:aink="http://schemas.microsoft.com/office/drawing/2016/ink" xmlns:am3d="http://schemas.microsoft.com/office/drawing/2017/model3d" xmlns:o="urn:schemas-microsoft-com:office:office" xmlns:r="http://schemas.openxmlformats.org/officeDocument/2006/relationships" xmlns:m="http://schemas.openxmlformats.org/officeDocument/2006/math" xmlns:v="urn:schemas-microsoft-com:vml" xmlns:wp14="http://schemas.microsoft.com/office/word/2010/wordprocessingDrawing" xmlns:wp="http://schemas.openxmlformats.org/drawingml/2006/wordprocessingDrawing" xmlns:w10="urn:schemas-microsoft-com:office:word" xmlns:w="http://schemas.openxmlformats.org/wordprocessingml/2006/main" xmlns:w14="http://schemas.microsoft.com/office/word/2010/wordml" xmlns:w15="http://schemas.microsoft.com/office/word/2012/wordml" xmlns:w16cex="http://schemas.microsoft.com/office/word/2018/wordml/cex" xmlns:w16cid="http://schemas.microsoft.com/office/word/2016/wordml/cid" xmlns:w16="http://schemas.microsoft.com/office/word/2018/wordml" xmlns:w16se="http://schemas.microsoft.com/office/word/2015/wordml/symex" xmlns:wpg="http://schemas.microsoft.com/office/word/2010/wordprocessingGroup" xmlns:wpi="http://schemas.microsoft.com/office/word/2010/wordprocessingInk" xmlns:wne="http://schemas.microsoft.com/office/word/2006/wordml" xmlns:wps="http://schemas.microsoft.com/office/word/2010/wordprocessingShape" mc:Ignorable="w14 w15 w16se w16cid w16 w16cex wp14">
+<w:document xmlns:wpc="http://schemas.microsoft.com/office/word/2010/wordprocessingCanvas" xmlns:cx="http://schemas.microsoft.com/office/drawing/2014/chartex" xmlns:cx1="http://schemas.microsoft.com/office/drawing/2015/9/8/chartex" xmlns:cx2="http://schemas.microsoft.com/office/drawing/2015/10/21/chartex" xmlns:cx3="http://schemas.microsoft.com/office/drawing/2016/5/9/chartex" xmlns:cx4="http://schemas.microsoft.com/office/drawing/2016/5/10/chartex" xmlns:cx5="http://schemas.microsoft.com/office/drawing/2016/5/11/chartex" xmlns:cx6="http://schemas.microsoft.com/office/drawing/2016/5/12/chartex" xmlns:cx7="http://schemas.microsoft.com/office/drawing/2016/5/13/chartex" xmlns:cx8="http://schemas.microsoft.com/office/drawing/2016/5/14/chartex" xmlns:mc="http://schemas.openxmlformats.org/markup-compatibility/2006" xmlns:aink="http://schemas.microsoft.com/office/drawing/2016/ink" xmlns:am3d="http://schemas.microsoft.com/office/drawing/2017/model3d" xmlns:o="urn:schemas-microsoft-com:office:office" xmlns:oel="http://schemas.microsoft.com/office/2019/extlst" xmlns:r="http://schemas.openxmlformats.org/officeDocument/2006/relationships" xmlns:m="http://schemas.openxmlformats.org/officeDocument/2006/math" xmlns:v="urn:schemas-microsoft-com:vml" xmlns:wp14="http://schemas.microsoft.com/office/word/2010/wordprocessingDrawing" xmlns:wp="http://schemas.openxmlformats.org/drawingml/2006/wordprocessingDrawing" xmlns:w10="urn:schemas-microsoft-com:office:word" xmlns:w="http://schemas.openxmlformats.org/wordprocessingml/2006/main" xmlns:w14="http://schemas.microsoft.com/office/word/2010/wordml" xmlns:w15="http://schemas.microsoft.com/office/word/2012/wordml" xmlns:w16cex="http://schemas.microsoft.com/office/word/2018/wordml/cex" xmlns:w16cid="http://schemas.microsoft.com/office/word/2016/wordml/cid" xmlns:w16="http://schemas.microsoft.com/office/word/2018/wordml" xmlns:w16du="http://schemas.microsoft.com/office/word/2023/wordml/word16du" xmlns:w16sdtdh="http://schemas.microsoft.com/office/word/2020/wordml/sdtdatahash" xmlns:w16sdtfl="http://schemas.microsoft.com/office/word/2024/wordml/sdtformatlock" xmlns:w16se="http://schemas.microsoft.com/office/word/2015/wordml/symex" xmlns:wpg="http://schemas.microsoft.com/office/word/2010/wordprocessingGroup" xmlns:wpi="http://schemas.microsoft.com/office/word/2010/wordprocessingInk" xmlns:wne="http://schemas.microsoft.com/office/word/2006/wordml" xmlns:wps="http://schemas.microsoft.com/office/word/2010/wordprocessingShape" mc:Ignorable="w14 w15 w16se w16cid w16 w16cex w16sdtdh w16sdtfl w16du wp14">
   <w:background w:color="FFFFFF"/>
   <w:body>
     <w:p>
@@ -274,7 +274,6 @@
         <w:spacing w:line="360" w:lineRule="auto"/>
         <w:jc w:val="center"/>
       </w:pPr>
-      <w:proofErr w:type="spellStart"/>
       <w:r>
         <w:rPr>
           <w:rFonts w:ascii="Arial" w:hAnsi="Arial" w:cs="Arial"/>
@@ -285,7 +284,6 @@
         </w:rPr>
         <w:t>Urbanly</w:t>
       </w:r>
-      <w:proofErr w:type="spellEnd"/>
     </w:p>
     <w:p>
       <w:pPr>
@@ -1474,7 +1472,31 @@
         <w:rPr>
           <w:rFonts w:ascii="Arial" w:hAnsi="Arial" w:cs="Arial"/>
         </w:rPr>
-        <w:t xml:space="preserve"> O usuário deve poder se cadastrar informando nome, e-mail e senha para criar uma conta no aplicativo.</w:t>
+        <w:t xml:space="preserve"> O usuário deve poder se cadastrar informando</w:t>
+      </w:r>
+      <w:r>
+        <w:rPr>
+          <w:rFonts w:ascii="Arial" w:hAnsi="Arial" w:cs="Arial"/>
+        </w:rPr>
+        <w:t xml:space="preserve"> através cadastro dados inseridos no próprio sistem como</w:t>
+      </w:r>
+      <w:r>
+        <w:rPr>
+          <w:rFonts w:ascii="Arial" w:hAnsi="Arial" w:cs="Arial"/>
+        </w:rPr>
+        <w:t xml:space="preserve"> nome, e-mail e senha para criar uma conta no aplicativo</w:t>
+      </w:r>
+      <w:r>
+        <w:rPr>
+          <w:rFonts w:ascii="Arial" w:hAnsi="Arial" w:cs="Arial"/>
+        </w:rPr>
+        <w:t xml:space="preserve"> ou através de integração com o google</w:t>
+      </w:r>
+      <w:r>
+        <w:rPr>
+          <w:rFonts w:ascii="Arial" w:hAnsi="Arial" w:cs="Arial"/>
+        </w:rPr>
+        <w:t>.</w:t>
       </w:r>
     </w:p>
     <w:p>
@@ -1547,7 +1569,19 @@
         <w:rPr>
           <w:rFonts w:ascii="Arial" w:hAnsi="Arial" w:cs="Arial"/>
         </w:rPr>
-        <w:t xml:space="preserve"> O usuário deve se autenticar com e-mail e senha para acessar as funcionalidades principais do aplicativo.</w:t>
+        <w:t xml:space="preserve"> O usuário deve se autenticar com e-mail e senha</w:t>
+      </w:r>
+      <w:r>
+        <w:rPr>
+          <w:rFonts w:ascii="Arial" w:hAnsi="Arial" w:cs="Arial"/>
+        </w:rPr>
+        <w:t xml:space="preserve"> ou login social do google</w:t>
+      </w:r>
+      <w:r>
+        <w:rPr>
+          <w:rFonts w:ascii="Arial" w:hAnsi="Arial" w:cs="Arial"/>
+        </w:rPr>
+        <w:t xml:space="preserve"> para acessar as funcionalidades principais do aplicativo.</w:t>
       </w:r>
     </w:p>
     <w:p>
@@ -1741,6 +1775,7 @@
           <w:rStyle w:val="Forte"/>
           <w:rFonts w:ascii="Arial" w:hAnsi="Arial" w:cs="Arial"/>
         </w:rPr>
+        <w:lastRenderedPageBreak/>
         <w:t>Prioridade:</w:t>
       </w:r>
       <w:r>
@@ -1778,14 +1813,7 @@
         <w:rPr>
           <w:rFonts w:ascii="Arial" w:hAnsi="Arial" w:cs="Arial"/>
         </w:rPr>
-        <w:t xml:space="preserve"> O sistema deve permitir que o usuário pesquise estabelecimentos por </w:t>
-      </w:r>
-      <w:r>
-        <w:rPr>
-          <w:rFonts w:ascii="Arial" w:hAnsi="Arial" w:cs="Arial"/>
-        </w:rPr>
-        <w:lastRenderedPageBreak/>
-        <w:t>meio de palavras-chave ou nome do local, retornando os resultados correspondentes.</w:t>
+        <w:t xml:space="preserve"> O sistema deve permitir que o usuário pesquise estabelecimentos por meio de palavras-chave ou nome do local, retornando os resultados correspondentes.</w:t>
       </w:r>
     </w:p>
     <w:p>
@@ -2240,7 +2268,6 @@
         <w:rPr>
           <w:rFonts w:ascii="Arial" w:hAnsi="Arial" w:cs="Arial"/>
         </w:rPr>
-        <w:lastRenderedPageBreak/>
         <w:t>[RF01</w:t>
       </w:r>
       <w:r>
@@ -2668,6 +2695,7 @@
         <w:rPr>
           <w:rFonts w:ascii="Arial" w:hAnsi="Arial" w:cs="Arial"/>
         </w:rPr>
+        <w:lastRenderedPageBreak/>
         <w:t>[RNF001] – Usabilidade</w:t>
       </w:r>
     </w:p>
@@ -2683,373 +2711,372 @@
           <w:rStyle w:val="Forte"/>
           <w:rFonts w:ascii="Arial" w:hAnsi="Arial" w:cs="Arial"/>
         </w:rPr>
+        <w:t>Prioridade:</w:t>
+      </w:r>
+      <w:r>
+        <w:rPr>
+          <w:rFonts w:ascii="Arial" w:hAnsi="Arial" w:cs="Arial"/>
+        </w:rPr>
+        <w:t xml:space="preserve"> </w:t>
+      </w:r>
+      <w:r>
+        <w:rPr>
+          <w:rFonts w:ascii="Segoe UI Emoji" w:hAnsi="Segoe UI Emoji" w:cs="Segoe UI Emoji"/>
+        </w:rPr>
+        <w:t>◼</w:t>
+      </w:r>
+      <w:r>
+        <w:rPr>
+          <w:rFonts w:ascii="Arial" w:hAnsi="Arial" w:cs="Arial"/>
+        </w:rPr>
+        <w:t xml:space="preserve"> Essencial • Importante • Desejável</w:t>
+      </w:r>
+      <w:r>
+        <w:rPr>
+          <w:rFonts w:ascii="Arial" w:hAnsi="Arial" w:cs="Arial"/>
+        </w:rPr>
+        <w:br/>
+      </w:r>
+      <w:r>
+        <w:rPr>
+          <w:rStyle w:val="Forte"/>
+          <w:rFonts w:ascii="Arial" w:hAnsi="Arial" w:cs="Arial"/>
+        </w:rPr>
+        <w:t>Descrição:</w:t>
+      </w:r>
+      <w:r>
+        <w:rPr>
+          <w:rFonts w:ascii="Arial" w:hAnsi="Arial" w:cs="Arial"/>
+        </w:rPr>
+        <w:t xml:space="preserve"> O sistema deve prover uma interface simples, intuitiva e de fácil navegação, permitindo que os usuários realizem buscas, visualizem estabelecimentos e utilizem as principais funcionalidades sem necessidade de treinamento prévio.</w:t>
+      </w:r>
+    </w:p>
+    <w:p>
+      <w:pPr>
+        <w:rPr>
+          <w:rFonts w:ascii="Arial" w:hAnsi="Arial" w:cs="Arial"/>
+        </w:rPr>
+      </w:pPr>
+    </w:p>
+    <w:p>
+      <w:pPr>
+        <w:pStyle w:val="Ttulo3"/>
+        <w:rPr>
+          <w:rFonts w:ascii="Arial" w:hAnsi="Arial" w:cs="Arial"/>
+        </w:rPr>
+      </w:pPr>
+      <w:r>
+        <w:rPr>
+          <w:rFonts w:ascii="Arial" w:hAnsi="Arial" w:cs="Arial"/>
+        </w:rPr>
+        <w:t>[RNF002] – Apresentação da Interface Gráfica</w:t>
+      </w:r>
+    </w:p>
+    <w:p>
+      <w:pPr>
+        <w:pStyle w:val="NormalWeb"/>
+        <w:rPr>
+          <w:rFonts w:ascii="Arial" w:hAnsi="Arial" w:cs="Arial"/>
+        </w:rPr>
+      </w:pPr>
+      <w:r>
+        <w:rPr>
+          <w:rStyle w:val="Forte"/>
+          <w:rFonts w:ascii="Arial" w:hAnsi="Arial" w:cs="Arial"/>
+        </w:rPr>
+        <w:t>Prioridade:</w:t>
+      </w:r>
+      <w:r>
+        <w:rPr>
+          <w:rFonts w:ascii="Arial" w:hAnsi="Arial" w:cs="Arial"/>
+        </w:rPr>
+        <w:t xml:space="preserve"> • Essencial </w:t>
+      </w:r>
+      <w:r>
+        <w:rPr>
+          <w:rFonts w:ascii="Segoe UI Emoji" w:hAnsi="Segoe UI Emoji" w:cs="Segoe UI Emoji"/>
+        </w:rPr>
+        <w:t>◼</w:t>
+      </w:r>
+      <w:r>
+        <w:rPr>
+          <w:rFonts w:ascii="Arial" w:hAnsi="Arial" w:cs="Arial"/>
+        </w:rPr>
+        <w:t xml:space="preserve"> Importante • Desejável</w:t>
+      </w:r>
+      <w:r>
+        <w:rPr>
+          <w:rFonts w:ascii="Arial" w:hAnsi="Arial" w:cs="Arial"/>
+        </w:rPr>
+        <w:br/>
+      </w:r>
+      <w:r>
+        <w:rPr>
+          <w:rStyle w:val="Forte"/>
+          <w:rFonts w:ascii="Arial" w:hAnsi="Arial" w:cs="Arial"/>
+        </w:rPr>
+        <w:t>Descrição:</w:t>
+      </w:r>
+      <w:r>
+        <w:rPr>
+          <w:rFonts w:ascii="Arial" w:hAnsi="Arial" w:cs="Arial"/>
+        </w:rPr>
+        <w:t xml:space="preserve"> A interface do aplicativo deve ser responsiva e compatível com dispositivos móveis Android e iOS, apresentando elementos visuais claros, ícones intuitivos, tipografia legível e uso padronizado de cores, garantindo consistência visual e boa experiência do usuário.</w:t>
+      </w:r>
+    </w:p>
+    <w:p>
+      <w:pPr>
+        <w:rPr>
+          <w:rFonts w:ascii="Arial" w:hAnsi="Arial" w:cs="Arial"/>
+        </w:rPr>
+      </w:pPr>
+    </w:p>
+    <w:p>
+      <w:pPr>
+        <w:pStyle w:val="Ttulo3"/>
+        <w:rPr>
+          <w:rFonts w:ascii="Arial" w:hAnsi="Arial" w:cs="Arial"/>
+        </w:rPr>
+      </w:pPr>
+      <w:r>
+        <w:rPr>
+          <w:rFonts w:ascii="Arial" w:hAnsi="Arial" w:cs="Arial"/>
+        </w:rPr>
+        <w:t>[RNF003] – Segurança e Privacidade</w:t>
+      </w:r>
+    </w:p>
+    <w:p>
+      <w:pPr>
+        <w:pStyle w:val="NormalWeb"/>
+        <w:rPr>
+          <w:rFonts w:ascii="Arial" w:hAnsi="Arial" w:cs="Arial"/>
+        </w:rPr>
+      </w:pPr>
+      <w:r>
+        <w:rPr>
+          <w:rStyle w:val="Forte"/>
+          <w:rFonts w:ascii="Arial" w:hAnsi="Arial" w:cs="Arial"/>
+        </w:rPr>
+        <w:t>Prioridade:</w:t>
+      </w:r>
+      <w:r>
+        <w:rPr>
+          <w:rFonts w:ascii="Arial" w:hAnsi="Arial" w:cs="Arial"/>
+        </w:rPr>
+        <w:t xml:space="preserve"> </w:t>
+      </w:r>
+      <w:r>
+        <w:rPr>
+          <w:rFonts w:ascii="Segoe UI Emoji" w:hAnsi="Segoe UI Emoji" w:cs="Segoe UI Emoji"/>
+        </w:rPr>
+        <w:t>◼</w:t>
+      </w:r>
+      <w:r>
+        <w:rPr>
+          <w:rFonts w:ascii="Arial" w:hAnsi="Arial" w:cs="Arial"/>
+        </w:rPr>
+        <w:t xml:space="preserve"> Essencial • Importante • Desejável</w:t>
+      </w:r>
+      <w:r>
+        <w:rPr>
+          <w:rFonts w:ascii="Arial" w:hAnsi="Arial" w:cs="Arial"/>
+        </w:rPr>
+        <w:br/>
+      </w:r>
+      <w:r>
+        <w:rPr>
+          <w:rStyle w:val="Forte"/>
+          <w:rFonts w:ascii="Arial" w:hAnsi="Arial" w:cs="Arial"/>
+        </w:rPr>
+        <w:t>Descrição:</w:t>
+      </w:r>
+      <w:r>
+        <w:rPr>
+          <w:rFonts w:ascii="Arial" w:hAnsi="Arial" w:cs="Arial"/>
+        </w:rPr>
+        <w:t xml:space="preserve"> Os dados dos usuários, incluindo informações de login e localização, devem ser protegidos por mecanismos de criptografia e armazenados de forma segura, em conformidade com a Lei Geral de Proteção de Dados (LGPD), garantindo que não sejam compartilhados sem consentimento do usuário.</w:t>
+      </w:r>
+    </w:p>
+    <w:p>
+      <w:pPr>
+        <w:rPr>
+          <w:rFonts w:ascii="Arial" w:hAnsi="Arial" w:cs="Arial"/>
+        </w:rPr>
+      </w:pPr>
+    </w:p>
+    <w:p>
+      <w:pPr>
+        <w:pStyle w:val="Ttulo3"/>
+        <w:rPr>
+          <w:rFonts w:ascii="Arial" w:hAnsi="Arial" w:cs="Arial"/>
+        </w:rPr>
+      </w:pPr>
+      <w:r>
+        <w:rPr>
+          <w:rFonts w:ascii="Arial" w:hAnsi="Arial" w:cs="Arial"/>
+        </w:rPr>
+        <w:t>[RNF004] – Compatibilidade</w:t>
+      </w:r>
+    </w:p>
+    <w:p>
+      <w:pPr>
+        <w:pStyle w:val="NormalWeb"/>
+        <w:rPr>
+          <w:rFonts w:ascii="Arial" w:hAnsi="Arial" w:cs="Arial"/>
+        </w:rPr>
+      </w:pPr>
+      <w:r>
+        <w:rPr>
+          <w:rStyle w:val="Forte"/>
+          <w:rFonts w:ascii="Arial" w:hAnsi="Arial" w:cs="Arial"/>
+        </w:rPr>
+        <w:t>Prioridade:</w:t>
+      </w:r>
+      <w:r>
+        <w:rPr>
+          <w:rFonts w:ascii="Arial" w:hAnsi="Arial" w:cs="Arial"/>
+        </w:rPr>
+        <w:t xml:space="preserve"> </w:t>
+      </w:r>
+      <w:r>
+        <w:rPr>
+          <w:rFonts w:ascii="Segoe UI Emoji" w:hAnsi="Segoe UI Emoji" w:cs="Segoe UI Emoji"/>
+        </w:rPr>
+        <w:t>◼</w:t>
+      </w:r>
+      <w:r>
+        <w:rPr>
+          <w:rFonts w:ascii="Arial" w:hAnsi="Arial" w:cs="Arial"/>
+        </w:rPr>
+        <w:t xml:space="preserve"> Essencial • Importante • Desejável</w:t>
+      </w:r>
+      <w:r>
+        <w:rPr>
+          <w:rFonts w:ascii="Arial" w:hAnsi="Arial" w:cs="Arial"/>
+        </w:rPr>
+        <w:br/>
+      </w:r>
+      <w:r>
+        <w:rPr>
+          <w:rStyle w:val="Forte"/>
+          <w:rFonts w:ascii="Arial" w:hAnsi="Arial" w:cs="Arial"/>
+        </w:rPr>
+        <w:t>Descrição:</w:t>
+      </w:r>
+      <w:r>
+        <w:rPr>
+          <w:rFonts w:ascii="Arial" w:hAnsi="Arial" w:cs="Arial"/>
+        </w:rPr>
+        <w:t xml:space="preserve"> O aplicativo deve ser compatível com os sistemas operacionais Android e iOS, contemplando as versões mais utilizadas no mercado no momento do desenvolvimento do MVP.</w:t>
+      </w:r>
+    </w:p>
+    <w:p>
+      <w:pPr>
+        <w:rPr>
+          <w:rFonts w:ascii="Arial" w:hAnsi="Arial" w:cs="Arial"/>
+        </w:rPr>
+      </w:pPr>
+    </w:p>
+    <w:p>
+      <w:pPr>
+        <w:pStyle w:val="Ttulo3"/>
+        <w:rPr>
+          <w:rFonts w:ascii="Arial" w:hAnsi="Arial" w:cs="Arial"/>
+        </w:rPr>
+      </w:pPr>
+      <w:r>
+        <w:rPr>
+          <w:rFonts w:ascii="Arial" w:hAnsi="Arial" w:cs="Arial"/>
+        </w:rPr>
+        <w:t>[RNF005] – Escalabilidade</w:t>
+      </w:r>
+    </w:p>
+    <w:p>
+      <w:pPr>
+        <w:pStyle w:val="NormalWeb"/>
+        <w:rPr>
+          <w:rFonts w:ascii="Arial" w:hAnsi="Arial" w:cs="Arial"/>
+        </w:rPr>
+      </w:pPr>
+      <w:r>
+        <w:rPr>
+          <w:rStyle w:val="Forte"/>
+          <w:rFonts w:ascii="Arial" w:hAnsi="Arial" w:cs="Arial"/>
+        </w:rPr>
+        <w:t>Prioridade:</w:t>
+      </w:r>
+      <w:r>
+        <w:rPr>
+          <w:rFonts w:ascii="Arial" w:hAnsi="Arial" w:cs="Arial"/>
+        </w:rPr>
+        <w:t xml:space="preserve"> • Essencial </w:t>
+      </w:r>
+      <w:r>
+        <w:rPr>
+          <w:rFonts w:ascii="Segoe UI Emoji" w:hAnsi="Segoe UI Emoji" w:cs="Segoe UI Emoji"/>
+        </w:rPr>
+        <w:t>◼</w:t>
+      </w:r>
+      <w:r>
+        <w:rPr>
+          <w:rFonts w:ascii="Arial" w:hAnsi="Arial" w:cs="Arial"/>
+        </w:rPr>
+        <w:t xml:space="preserve"> Importante • Desejável</w:t>
+      </w:r>
+      <w:r>
+        <w:rPr>
+          <w:rFonts w:ascii="Arial" w:hAnsi="Arial" w:cs="Arial"/>
+        </w:rPr>
+        <w:br/>
+      </w:r>
+      <w:r>
+        <w:rPr>
+          <w:rStyle w:val="Forte"/>
+          <w:rFonts w:ascii="Arial" w:hAnsi="Arial" w:cs="Arial"/>
+        </w:rPr>
+        <w:t>Descrição:</w:t>
+      </w:r>
+      <w:r>
+        <w:rPr>
+          <w:rFonts w:ascii="Arial" w:hAnsi="Arial" w:cs="Arial"/>
+        </w:rPr>
+        <w:t xml:space="preserve"> O sistema deve suportar o crescimento da base de usuários e de estabelecimentos cadastrados, permitindo escalabilidade horizontal por meio da adição de novos servidores ou recursos em nuvem, sem comprometer o desempenho da aplicação.</w:t>
+      </w:r>
+    </w:p>
+    <w:p>
+      <w:pPr>
+        <w:rPr>
+          <w:rFonts w:ascii="Arial" w:hAnsi="Arial" w:cs="Arial"/>
+        </w:rPr>
+      </w:pPr>
+    </w:p>
+    <w:p>
+      <w:pPr>
+        <w:pStyle w:val="Ttulo3"/>
+        <w:rPr>
+          <w:rFonts w:ascii="Arial" w:hAnsi="Arial" w:cs="Arial"/>
+        </w:rPr>
+      </w:pPr>
+      <w:r>
+        <w:rPr>
+          <w:rFonts w:ascii="Arial" w:hAnsi="Arial" w:cs="Arial"/>
+        </w:rPr>
         <w:lastRenderedPageBreak/>
-        <w:t>Prioridade:</w:t>
-      </w:r>
-      <w:r>
-        <w:rPr>
-          <w:rFonts w:ascii="Arial" w:hAnsi="Arial" w:cs="Arial"/>
-        </w:rPr>
-        <w:t xml:space="preserve"> </w:t>
-      </w:r>
-      <w:r>
-        <w:rPr>
-          <w:rFonts w:ascii="Segoe UI Emoji" w:hAnsi="Segoe UI Emoji" w:cs="Segoe UI Emoji"/>
-        </w:rPr>
-        <w:t>◼</w:t>
-      </w:r>
-      <w:r>
-        <w:rPr>
-          <w:rFonts w:ascii="Arial" w:hAnsi="Arial" w:cs="Arial"/>
-        </w:rPr>
-        <w:t xml:space="preserve"> Essencial • Importante • Desejável</w:t>
-      </w:r>
-      <w:r>
-        <w:rPr>
-          <w:rFonts w:ascii="Arial" w:hAnsi="Arial" w:cs="Arial"/>
-        </w:rPr>
-        <w:br/>
-      </w:r>
+        <w:t>[RNF006] – Manutenibilidade</w:t>
+      </w:r>
+    </w:p>
+    <w:p>
+      <w:pPr>
+        <w:pStyle w:val="NormalWeb"/>
+        <w:rPr>
+          <w:rFonts w:ascii="Arial" w:hAnsi="Arial" w:cs="Arial"/>
+        </w:rPr>
+      </w:pPr>
       <w:r>
         <w:rPr>
           <w:rStyle w:val="Forte"/>
           <w:rFonts w:ascii="Arial" w:hAnsi="Arial" w:cs="Arial"/>
         </w:rPr>
-        <w:t>Descrição:</w:t>
-      </w:r>
-      <w:r>
-        <w:rPr>
-          <w:rFonts w:ascii="Arial" w:hAnsi="Arial" w:cs="Arial"/>
-        </w:rPr>
-        <w:t xml:space="preserve"> O sistema deve prover uma interface simples, intuitiva e de fácil navegação, permitindo que os usuários realizem buscas, visualizem estabelecimentos e utilizem as principais funcionalidades sem necessidade de treinamento prévio.</w:t>
-      </w:r>
-    </w:p>
-    <w:p>
-      <w:pPr>
-        <w:rPr>
-          <w:rFonts w:ascii="Arial" w:hAnsi="Arial" w:cs="Arial"/>
-        </w:rPr>
-      </w:pPr>
-    </w:p>
-    <w:p>
-      <w:pPr>
-        <w:pStyle w:val="Ttulo3"/>
-        <w:rPr>
-          <w:rFonts w:ascii="Arial" w:hAnsi="Arial" w:cs="Arial"/>
-        </w:rPr>
-      </w:pPr>
-      <w:r>
-        <w:rPr>
-          <w:rFonts w:ascii="Arial" w:hAnsi="Arial" w:cs="Arial"/>
-        </w:rPr>
-        <w:t>[RNF002] – Apresentação da Interface Gráfica</w:t>
-      </w:r>
-    </w:p>
-    <w:p>
-      <w:pPr>
-        <w:pStyle w:val="NormalWeb"/>
-        <w:rPr>
-          <w:rFonts w:ascii="Arial" w:hAnsi="Arial" w:cs="Arial"/>
-        </w:rPr>
-      </w:pPr>
-      <w:r>
-        <w:rPr>
-          <w:rStyle w:val="Forte"/>
-          <w:rFonts w:ascii="Arial" w:hAnsi="Arial" w:cs="Arial"/>
-        </w:rPr>
-        <w:t>Prioridade:</w:t>
-      </w:r>
-      <w:r>
-        <w:rPr>
-          <w:rFonts w:ascii="Arial" w:hAnsi="Arial" w:cs="Arial"/>
-        </w:rPr>
-        <w:t xml:space="preserve"> • Essencial </w:t>
-      </w:r>
-      <w:r>
-        <w:rPr>
-          <w:rFonts w:ascii="Segoe UI Emoji" w:hAnsi="Segoe UI Emoji" w:cs="Segoe UI Emoji"/>
-        </w:rPr>
-        <w:t>◼</w:t>
-      </w:r>
-      <w:r>
-        <w:rPr>
-          <w:rFonts w:ascii="Arial" w:hAnsi="Arial" w:cs="Arial"/>
-        </w:rPr>
-        <w:t xml:space="preserve"> Importante • Desejável</w:t>
-      </w:r>
-      <w:r>
-        <w:rPr>
-          <w:rFonts w:ascii="Arial" w:hAnsi="Arial" w:cs="Arial"/>
-        </w:rPr>
-        <w:br/>
-      </w:r>
-      <w:r>
-        <w:rPr>
-          <w:rStyle w:val="Forte"/>
-          <w:rFonts w:ascii="Arial" w:hAnsi="Arial" w:cs="Arial"/>
-        </w:rPr>
-        <w:t>Descrição:</w:t>
-      </w:r>
-      <w:r>
-        <w:rPr>
-          <w:rFonts w:ascii="Arial" w:hAnsi="Arial" w:cs="Arial"/>
-        </w:rPr>
-        <w:t xml:space="preserve"> A interface do aplicativo deve ser responsiva e compatível com dispositivos móveis Android e iOS, apresentando elementos visuais claros, ícones intuitivos, tipografia legível e uso padronizado de cores, garantindo consistência visual e boa experiência do usuário.</w:t>
-      </w:r>
-    </w:p>
-    <w:p>
-      <w:pPr>
-        <w:rPr>
-          <w:rFonts w:ascii="Arial" w:hAnsi="Arial" w:cs="Arial"/>
-        </w:rPr>
-      </w:pPr>
-    </w:p>
-    <w:p>
-      <w:pPr>
-        <w:pStyle w:val="Ttulo3"/>
-        <w:rPr>
-          <w:rFonts w:ascii="Arial" w:hAnsi="Arial" w:cs="Arial"/>
-        </w:rPr>
-      </w:pPr>
-      <w:r>
-        <w:rPr>
-          <w:rFonts w:ascii="Arial" w:hAnsi="Arial" w:cs="Arial"/>
-        </w:rPr>
-        <w:t>[RNF003] – Segurança e Privacidade</w:t>
-      </w:r>
-    </w:p>
-    <w:p>
-      <w:pPr>
-        <w:pStyle w:val="NormalWeb"/>
-        <w:rPr>
-          <w:rFonts w:ascii="Arial" w:hAnsi="Arial" w:cs="Arial"/>
-        </w:rPr>
-      </w:pPr>
-      <w:r>
-        <w:rPr>
-          <w:rStyle w:val="Forte"/>
-          <w:rFonts w:ascii="Arial" w:hAnsi="Arial" w:cs="Arial"/>
-        </w:rPr>
-        <w:t>Prioridade:</w:t>
-      </w:r>
-      <w:r>
-        <w:rPr>
-          <w:rFonts w:ascii="Arial" w:hAnsi="Arial" w:cs="Arial"/>
-        </w:rPr>
-        <w:t xml:space="preserve"> </w:t>
-      </w:r>
-      <w:r>
-        <w:rPr>
-          <w:rFonts w:ascii="Segoe UI Emoji" w:hAnsi="Segoe UI Emoji" w:cs="Segoe UI Emoji"/>
-        </w:rPr>
-        <w:t>◼</w:t>
-      </w:r>
-      <w:r>
-        <w:rPr>
-          <w:rFonts w:ascii="Arial" w:hAnsi="Arial" w:cs="Arial"/>
-        </w:rPr>
-        <w:t xml:space="preserve"> Essencial • Importante • Desejável</w:t>
-      </w:r>
-      <w:r>
-        <w:rPr>
-          <w:rFonts w:ascii="Arial" w:hAnsi="Arial" w:cs="Arial"/>
-        </w:rPr>
-        <w:br/>
-      </w:r>
-      <w:r>
-        <w:rPr>
-          <w:rStyle w:val="Forte"/>
-          <w:rFonts w:ascii="Arial" w:hAnsi="Arial" w:cs="Arial"/>
-        </w:rPr>
-        <w:t>Descrição:</w:t>
-      </w:r>
-      <w:r>
-        <w:rPr>
-          <w:rFonts w:ascii="Arial" w:hAnsi="Arial" w:cs="Arial"/>
-        </w:rPr>
-        <w:t xml:space="preserve"> Os dados dos usuários, incluindo informações de login e localização, devem ser protegidos por mecanismos de criptografia e armazenados de forma segura, em conformidade com a Lei Geral de Proteção de Dados (LGPD), garantindo que não sejam compartilhados sem consentimento do usuário.</w:t>
-      </w:r>
-    </w:p>
-    <w:p>
-      <w:pPr>
-        <w:rPr>
-          <w:rFonts w:ascii="Arial" w:hAnsi="Arial" w:cs="Arial"/>
-        </w:rPr>
-      </w:pPr>
-    </w:p>
-    <w:p>
-      <w:pPr>
-        <w:pStyle w:val="Ttulo3"/>
-        <w:rPr>
-          <w:rFonts w:ascii="Arial" w:hAnsi="Arial" w:cs="Arial"/>
-        </w:rPr>
-      </w:pPr>
-      <w:r>
-        <w:rPr>
-          <w:rFonts w:ascii="Arial" w:hAnsi="Arial" w:cs="Arial"/>
-        </w:rPr>
-        <w:t>[RNF004] – Compatibilidade</w:t>
-      </w:r>
-    </w:p>
-    <w:p>
-      <w:pPr>
-        <w:pStyle w:val="NormalWeb"/>
-        <w:rPr>
-          <w:rFonts w:ascii="Arial" w:hAnsi="Arial" w:cs="Arial"/>
-        </w:rPr>
-      </w:pPr>
-      <w:r>
-        <w:rPr>
-          <w:rStyle w:val="Forte"/>
-          <w:rFonts w:ascii="Arial" w:hAnsi="Arial" w:cs="Arial"/>
-        </w:rPr>
-        <w:t>Prioridade:</w:t>
-      </w:r>
-      <w:r>
-        <w:rPr>
-          <w:rFonts w:ascii="Arial" w:hAnsi="Arial" w:cs="Arial"/>
-        </w:rPr>
-        <w:t xml:space="preserve"> </w:t>
-      </w:r>
-      <w:r>
-        <w:rPr>
-          <w:rFonts w:ascii="Segoe UI Emoji" w:hAnsi="Segoe UI Emoji" w:cs="Segoe UI Emoji"/>
-        </w:rPr>
-        <w:t>◼</w:t>
-      </w:r>
-      <w:r>
-        <w:rPr>
-          <w:rFonts w:ascii="Arial" w:hAnsi="Arial" w:cs="Arial"/>
-        </w:rPr>
-        <w:t xml:space="preserve"> Essencial • Importante • Desejável</w:t>
-      </w:r>
-      <w:r>
-        <w:rPr>
-          <w:rFonts w:ascii="Arial" w:hAnsi="Arial" w:cs="Arial"/>
-        </w:rPr>
-        <w:br/>
-      </w:r>
-      <w:r>
-        <w:rPr>
-          <w:rStyle w:val="Forte"/>
-          <w:rFonts w:ascii="Arial" w:hAnsi="Arial" w:cs="Arial"/>
-        </w:rPr>
-        <w:t>Descrição:</w:t>
-      </w:r>
-      <w:r>
-        <w:rPr>
-          <w:rFonts w:ascii="Arial" w:hAnsi="Arial" w:cs="Arial"/>
-        </w:rPr>
-        <w:t xml:space="preserve"> O aplicativo deve ser compatível com os sistemas operacionais Android e iOS, contemplando as versões mais utilizadas no mercado no momento do desenvolvimento do MVP.</w:t>
-      </w:r>
-    </w:p>
-    <w:p>
-      <w:pPr>
-        <w:rPr>
-          <w:rFonts w:ascii="Arial" w:hAnsi="Arial" w:cs="Arial"/>
-        </w:rPr>
-      </w:pPr>
-    </w:p>
-    <w:p>
-      <w:pPr>
-        <w:pStyle w:val="Ttulo3"/>
-        <w:rPr>
-          <w:rFonts w:ascii="Arial" w:hAnsi="Arial" w:cs="Arial"/>
-        </w:rPr>
-      </w:pPr>
-      <w:r>
-        <w:rPr>
-          <w:rFonts w:ascii="Arial" w:hAnsi="Arial" w:cs="Arial"/>
-        </w:rPr>
-        <w:t>[RNF005] – Escalabilidade</w:t>
-      </w:r>
-    </w:p>
-    <w:p>
-      <w:pPr>
-        <w:pStyle w:val="NormalWeb"/>
-        <w:rPr>
-          <w:rFonts w:ascii="Arial" w:hAnsi="Arial" w:cs="Arial"/>
-        </w:rPr>
-      </w:pPr>
-      <w:r>
-        <w:rPr>
-          <w:rStyle w:val="Forte"/>
-          <w:rFonts w:ascii="Arial" w:hAnsi="Arial" w:cs="Arial"/>
-        </w:rPr>
-        <w:t>Prioridade:</w:t>
-      </w:r>
-      <w:r>
-        <w:rPr>
-          <w:rFonts w:ascii="Arial" w:hAnsi="Arial" w:cs="Arial"/>
-        </w:rPr>
-        <w:t xml:space="preserve"> • Essencial </w:t>
-      </w:r>
-      <w:r>
-        <w:rPr>
-          <w:rFonts w:ascii="Segoe UI Emoji" w:hAnsi="Segoe UI Emoji" w:cs="Segoe UI Emoji"/>
-        </w:rPr>
-        <w:t>◼</w:t>
-      </w:r>
-      <w:r>
-        <w:rPr>
-          <w:rFonts w:ascii="Arial" w:hAnsi="Arial" w:cs="Arial"/>
-        </w:rPr>
-        <w:t xml:space="preserve"> Importante • Desejável</w:t>
-      </w:r>
-      <w:r>
-        <w:rPr>
-          <w:rFonts w:ascii="Arial" w:hAnsi="Arial" w:cs="Arial"/>
-        </w:rPr>
-        <w:br/>
-      </w:r>
-      <w:r>
-        <w:rPr>
-          <w:rStyle w:val="Forte"/>
-          <w:rFonts w:ascii="Arial" w:hAnsi="Arial" w:cs="Arial"/>
-        </w:rPr>
-        <w:t>Descrição:</w:t>
-      </w:r>
-      <w:r>
-        <w:rPr>
-          <w:rFonts w:ascii="Arial" w:hAnsi="Arial" w:cs="Arial"/>
-        </w:rPr>
-        <w:t xml:space="preserve"> O sistema deve suportar o crescimento da base de usuários e de estabelecimentos cadastrados, permitindo escalabilidade horizontal por meio da adição de novos servidores ou recursos em nuvem, sem comprometer o desempenho da aplicação.</w:t>
-      </w:r>
-    </w:p>
-    <w:p>
-      <w:pPr>
-        <w:rPr>
-          <w:rFonts w:ascii="Arial" w:hAnsi="Arial" w:cs="Arial"/>
-        </w:rPr>
-      </w:pPr>
-    </w:p>
-    <w:p>
-      <w:pPr>
-        <w:pStyle w:val="Ttulo3"/>
-        <w:rPr>
-          <w:rFonts w:ascii="Arial" w:hAnsi="Arial" w:cs="Arial"/>
-        </w:rPr>
-      </w:pPr>
-      <w:r>
-        <w:rPr>
-          <w:rFonts w:ascii="Arial" w:hAnsi="Arial" w:cs="Arial"/>
-        </w:rPr>
-        <w:t>[RNF006] – Manutenibilidade</w:t>
-      </w:r>
-    </w:p>
-    <w:p>
-      <w:pPr>
-        <w:pStyle w:val="NormalWeb"/>
-        <w:rPr>
-          <w:rFonts w:ascii="Arial" w:hAnsi="Arial" w:cs="Arial"/>
-        </w:rPr>
-      </w:pPr>
-      <w:r>
-        <w:rPr>
-          <w:rStyle w:val="Forte"/>
-          <w:rFonts w:ascii="Arial" w:hAnsi="Arial" w:cs="Arial"/>
-        </w:rPr>
-        <w:lastRenderedPageBreak/>
         <w:t>Prioridade:</w:t>
       </w:r>
       <w:r>
@@ -3187,35 +3214,7 @@
         <w:rPr>
           <w:rFonts w:ascii="Arial" w:hAnsi="Arial" w:cs="Arial"/>
         </w:rPr>
-        <w:t xml:space="preserve"> O sistema deve ser desenvolvido seguindo uma arquitetura modular, permitindo a separação entre </w:t>
-      </w:r>
-      <w:proofErr w:type="spellStart"/>
-      <w:r>
-        <w:rPr>
-          <w:rFonts w:ascii="Arial" w:hAnsi="Arial" w:cs="Arial"/>
-        </w:rPr>
-        <w:t>frontend</w:t>
-      </w:r>
-      <w:proofErr w:type="spellEnd"/>
-      <w:r>
-        <w:rPr>
-          <w:rFonts w:ascii="Arial" w:hAnsi="Arial" w:cs="Arial"/>
-        </w:rPr>
-        <w:t xml:space="preserve">, </w:t>
-      </w:r>
-      <w:proofErr w:type="spellStart"/>
-      <w:r>
-        <w:rPr>
-          <w:rFonts w:ascii="Arial" w:hAnsi="Arial" w:cs="Arial"/>
-        </w:rPr>
-        <w:t>backend</w:t>
-      </w:r>
-      <w:proofErr w:type="spellEnd"/>
-      <w:r>
-        <w:rPr>
-          <w:rFonts w:ascii="Arial" w:hAnsi="Arial" w:cs="Arial"/>
-        </w:rPr>
-        <w:t xml:space="preserve"> e banco de dados, facilitando manutenção, testes e futuras expansões.</w:t>
+        <w:t xml:space="preserve"> O sistema deve ser desenvolvido seguindo uma arquitetura modular, permitindo a separação entre frontend, backend e banco de dados, facilitando manutenção, testes e futuras expansões.</w:t>
       </w:r>
     </w:p>
     <w:p>
@@ -3361,35 +3360,7 @@
         <w:rPr>
           <w:rFonts w:ascii="Arial" w:hAnsi="Arial" w:cs="Arial"/>
         </w:rPr>
-        <w:t xml:space="preserve"> O código-fonte do sistema deve ser </w:t>
-      </w:r>
-      <w:proofErr w:type="spellStart"/>
-      <w:r>
-        <w:rPr>
-          <w:rFonts w:ascii="Arial" w:hAnsi="Arial" w:cs="Arial"/>
-        </w:rPr>
-        <w:t>versionado</w:t>
-      </w:r>
-      <w:proofErr w:type="spellEnd"/>
-      <w:r>
-        <w:rPr>
-          <w:rFonts w:ascii="Arial" w:hAnsi="Arial" w:cs="Arial"/>
-        </w:rPr>
-        <w:t xml:space="preserve"> utilizando sistema de controle de versão, como </w:t>
-      </w:r>
-      <w:proofErr w:type="spellStart"/>
-      <w:r>
-        <w:rPr>
-          <w:rFonts w:ascii="Arial" w:hAnsi="Arial" w:cs="Arial"/>
-        </w:rPr>
-        <w:t>Git</w:t>
-      </w:r>
-      <w:proofErr w:type="spellEnd"/>
-      <w:r>
-        <w:rPr>
-          <w:rFonts w:ascii="Arial" w:hAnsi="Arial" w:cs="Arial"/>
-        </w:rPr>
-        <w:t>, permitindo rastreamento de alterações, colaboração entre os desenvolvedores e recuperação de versões anteriores.</w:t>
+        <w:t xml:space="preserve"> O código-fonte do sistema deve ser versionado utilizando sistema de controle de versão, como Git, permitindo rastreamento de alterações, colaboração entre os desenvolvedores e recuperação de versões anteriores.</w:t>
       </w:r>
     </w:p>
     <w:p>
@@ -3483,6 +3454,7 @@
         <w:rPr>
           <w:rFonts w:ascii="Arial" w:hAnsi="Arial" w:cs="Arial"/>
         </w:rPr>
+        <w:lastRenderedPageBreak/>
         <w:t>[RNP005] – Documentação do Sistema</w:t>
       </w:r>
     </w:p>
@@ -3498,7 +3470,6 @@
           <w:rStyle w:val="Forte"/>
           <w:rFonts w:ascii="Arial" w:hAnsi="Arial" w:cs="Arial"/>
         </w:rPr>
-        <w:lastRenderedPageBreak/>
         <w:t>Prioridade:</w:t>
       </w:r>
       <w:r>
@@ -3618,48 +3589,46 @@
           <w:rFonts w:ascii="Arial" w:hAnsi="Arial" w:cs="Arial"/>
         </w:rPr>
       </w:pPr>
-      <w:bookmarkStart w:id="7" w:name="_GoBack"/>
+    </w:p>
+    <w:p>
+      <w:pPr>
+        <w:pStyle w:val="Ttulo3"/>
+        <w:rPr>
+          <w:rFonts w:ascii="Arial" w:hAnsi="Arial" w:cs="Arial"/>
+        </w:rPr>
+      </w:pPr>
+      <w:bookmarkStart w:id="7" w:name="_Toc105357692"/>
+      <w:r>
+        <w:rPr>
+          <w:rFonts w:ascii="Arial" w:hAnsi="Arial" w:cs="Arial"/>
+        </w:rPr>
+        <w:t>1</w:t>
+      </w:r>
+      <w:r>
+        <w:rPr>
+          <w:rFonts w:ascii="Arial" w:hAnsi="Arial" w:cs="Arial"/>
+        </w:rPr>
+        <w:t>.1.</w:t>
+      </w:r>
+      <w:r>
+        <w:rPr>
+          <w:rFonts w:ascii="Arial" w:hAnsi="Arial" w:cs="Arial"/>
+        </w:rPr>
+        <w:t>4</w:t>
+      </w:r>
+      <w:r>
+        <w:rPr>
+          <w:rFonts w:ascii="Arial" w:hAnsi="Arial" w:cs="Arial"/>
+        </w:rPr>
+        <w:t xml:space="preserve"> </w:t>
+      </w:r>
+      <w:r>
+        <w:rPr>
+          <w:rFonts w:ascii="Arial" w:hAnsi="Arial" w:cs="Arial"/>
+        </w:rPr>
+        <w:t>Regras de Negócio</w:t>
+      </w:r>
       <w:bookmarkEnd w:id="7"/>
-    </w:p>
-    <w:p>
-      <w:pPr>
-        <w:pStyle w:val="Ttulo3"/>
-        <w:rPr>
-          <w:rFonts w:ascii="Arial" w:hAnsi="Arial" w:cs="Arial"/>
-        </w:rPr>
-      </w:pPr>
-      <w:bookmarkStart w:id="8" w:name="_Toc105357692"/>
-      <w:r>
-        <w:rPr>
-          <w:rFonts w:ascii="Arial" w:hAnsi="Arial" w:cs="Arial"/>
-        </w:rPr>
-        <w:t>1</w:t>
-      </w:r>
-      <w:r>
-        <w:rPr>
-          <w:rFonts w:ascii="Arial" w:hAnsi="Arial" w:cs="Arial"/>
-        </w:rPr>
-        <w:t>.1.</w:t>
-      </w:r>
-      <w:r>
-        <w:rPr>
-          <w:rFonts w:ascii="Arial" w:hAnsi="Arial" w:cs="Arial"/>
-        </w:rPr>
-        <w:t>4</w:t>
-      </w:r>
-      <w:r>
-        <w:rPr>
-          <w:rFonts w:ascii="Arial" w:hAnsi="Arial" w:cs="Arial"/>
-        </w:rPr>
-        <w:t xml:space="preserve"> </w:t>
-      </w:r>
-      <w:r>
-        <w:rPr>
-          <w:rFonts w:ascii="Arial" w:hAnsi="Arial" w:cs="Arial"/>
-        </w:rPr>
-        <w:t>Regras de Negócio</w:t>
-      </w:r>
-      <w:bookmarkEnd w:id="8"/>
     </w:p>
     <w:p>
       <w:pPr>
@@ -3711,6 +3680,83 @@
         <w:pStyle w:val="Ttulo3"/>
         <w:rPr>
           <w:rFonts w:ascii="Arial" w:hAnsi="Arial" w:cs="Arial"/>
+        </w:rPr>
+      </w:pPr>
+      <w:r>
+        <w:rPr>
+          <w:rFonts w:ascii="Arial" w:hAnsi="Arial" w:cs="Arial"/>
+        </w:rPr>
+        <w:t>[RN00</w:t>
+      </w:r>
+      <w:r>
+        <w:rPr>
+          <w:rFonts w:ascii="Arial" w:hAnsi="Arial" w:cs="Arial"/>
+        </w:rPr>
+        <w:t>2</w:t>
+      </w:r>
+      <w:r>
+        <w:rPr>
+          <w:rFonts w:ascii="Arial" w:hAnsi="Arial" w:cs="Arial"/>
+        </w:rPr>
+        <w:t xml:space="preserve">] – Permitir </w:t>
+      </w:r>
+      <w:r>
+        <w:rPr>
+          <w:rFonts w:ascii="Arial" w:hAnsi="Arial" w:cs="Arial"/>
+        </w:rPr>
+        <w:t>buscas para u</w:t>
+      </w:r>
+      <w:r>
+        <w:rPr>
+          <w:rFonts w:ascii="Arial" w:hAnsi="Arial" w:cs="Arial"/>
+        </w:rPr>
+        <w:t xml:space="preserve">suários </w:t>
+      </w:r>
+      <w:r>
+        <w:rPr>
+          <w:rFonts w:ascii="Arial" w:hAnsi="Arial" w:cs="Arial"/>
+        </w:rPr>
+        <w:t xml:space="preserve">não </w:t>
+      </w:r>
+      <w:r>
+        <w:rPr>
+          <w:rFonts w:ascii="Arial" w:hAnsi="Arial" w:cs="Arial"/>
+        </w:rPr>
+        <w:t>autenticados</w:t>
+      </w:r>
+    </w:p>
+    <w:p>
+      <w:pPr>
+        <w:pStyle w:val="NormalWeb"/>
+        <w:rPr>
+          <w:rFonts w:ascii="Arial" w:hAnsi="Arial" w:cs="Arial"/>
+        </w:rPr>
+      </w:pPr>
+      <w:r>
+        <w:rPr>
+          <w:rStyle w:val="Forte"/>
+          <w:rFonts w:ascii="Arial" w:hAnsi="Arial" w:cs="Arial"/>
+        </w:rPr>
+        <w:t>Descrição:</w:t>
+      </w:r>
+      <w:r>
+        <w:rPr>
+          <w:rFonts w:ascii="Arial" w:hAnsi="Arial" w:cs="Arial"/>
+        </w:rPr>
+        <w:t xml:space="preserve"> O sistema deve permitir que apenas usuários </w:t>
+      </w:r>
+      <w:r>
+        <w:rPr>
+          <w:rFonts w:ascii="Arial" w:hAnsi="Arial" w:cs="Arial"/>
+        </w:rPr>
+        <w:t>consigam buscar estabelecimentos e ver os seus detalhes mesmo que não estejam autenticados.</w:t>
+      </w:r>
+    </w:p>
+    <w:p>
+      <w:pPr>
+        <w:pStyle w:val="Ttulo3"/>
+        <w:rPr>
+          <w:rFonts w:ascii="Arial" w:hAnsi="Arial" w:cs="Arial"/>
           <w:lang w:eastAsia="pt-BR"/>
         </w:rPr>
       </w:pPr>
@@ -3718,7 +3764,19 @@
         <w:rPr>
           <w:rFonts w:ascii="Arial" w:hAnsi="Arial" w:cs="Arial"/>
         </w:rPr>
-        <w:t>[RN002] – Limitar uma avaliação por usuário em cada estabelecimento</w:t>
+        <w:t>[RN00</w:t>
+      </w:r>
+      <w:r>
+        <w:rPr>
+          <w:rFonts w:ascii="Arial" w:hAnsi="Arial" w:cs="Arial"/>
+        </w:rPr>
+        <w:t>3</w:t>
+      </w:r>
+      <w:r>
+        <w:rPr>
+          <w:rFonts w:ascii="Arial" w:hAnsi="Arial" w:cs="Arial"/>
+        </w:rPr>
+        <w:t>] – Limitar uma avaliação por usuário em cada estabelecimento</w:t>
       </w:r>
     </w:p>
     <w:p>
@@ -3760,7 +3818,7 @@
         <w:rPr>
           <w:rFonts w:ascii="Arial" w:hAnsi="Arial" w:cs="Arial"/>
         </w:rPr>
-        <w:t>3</w:t>
+        <w:t>4</w:t>
       </w:r>
       <w:r>
         <w:rPr>
@@ -3802,13 +3860,13 @@
         <w:rPr>
           <w:rFonts w:ascii="Arial" w:hAnsi="Arial" w:cs="Arial"/>
         </w:rPr>
-        <w:t>[RN0</w:t>
-      </w:r>
-      <w:r>
-        <w:rPr>
-          <w:rFonts w:ascii="Arial" w:hAnsi="Arial" w:cs="Arial"/>
-        </w:rPr>
-        <w:t>04</w:t>
+        <w:t>[RN00</w:t>
+      </w:r>
+      <w:r>
+        <w:rPr>
+          <w:rFonts w:ascii="Arial" w:hAnsi="Arial" w:cs="Arial"/>
+        </w:rPr>
+        <w:t>5</w:t>
       </w:r>
       <w:r>
         <w:rPr>
@@ -3829,6 +3887,7 @@
           <w:rStyle w:val="Forte"/>
           <w:rFonts w:ascii="Arial" w:hAnsi="Arial" w:cs="Arial"/>
         </w:rPr>
+        <w:lastRenderedPageBreak/>
         <w:t>Descrição:</w:t>
       </w:r>
       <w:r>
@@ -3850,13 +3909,13 @@
         <w:rPr>
           <w:rFonts w:ascii="Arial" w:hAnsi="Arial" w:cs="Arial"/>
         </w:rPr>
-        <w:t>[RN0</w:t>
-      </w:r>
-      <w:r>
-        <w:rPr>
-          <w:rFonts w:ascii="Arial" w:hAnsi="Arial" w:cs="Arial"/>
-        </w:rPr>
-        <w:t>05</w:t>
+        <w:t>[RN00</w:t>
+      </w:r>
+      <w:r>
+        <w:rPr>
+          <w:rFonts w:ascii="Arial" w:hAnsi="Arial" w:cs="Arial"/>
+        </w:rPr>
+        <w:t>6</w:t>
       </w:r>
       <w:r>
         <w:rPr>
@@ -3909,7 +3968,7 @@
           <w:lang w:val="pt-BR"/>
         </w:rPr>
       </w:pPr>
-      <w:bookmarkStart w:id="9" w:name="_Toc395474966"/>
+      <w:bookmarkStart w:id="8" w:name="_Toc395474966"/>
       <w:r>
         <w:rPr>
           <w:rFonts w:cs="Arial"/>
@@ -3928,7 +3987,7 @@
         </w:rPr>
         <w:t xml:space="preserve"> </w:t>
       </w:r>
-      <w:bookmarkStart w:id="10" w:name="_Toc105357693"/>
+      <w:bookmarkStart w:id="9" w:name="_Toc105357693"/>
       <w:r>
         <w:rPr>
           <w:rFonts w:cs="Arial"/>
@@ -3938,7 +3997,7 @@
         </w:rPr>
         <w:t>Modelagem</w:t>
       </w:r>
-      <w:bookmarkEnd w:id="9"/>
+      <w:bookmarkEnd w:id="8"/>
       <w:r>
         <w:rPr>
           <w:rFonts w:cs="Arial"/>
@@ -3948,7 +4007,7 @@
         </w:rPr>
         <w:t xml:space="preserve"> dos requisitos funcionais</w:t>
       </w:r>
-      <w:bookmarkEnd w:id="10"/>
+      <w:bookmarkEnd w:id="9"/>
     </w:p>
     <w:p>
       <w:pPr>
@@ -3978,7 +4037,7 @@
           <w:highlight w:val="yellow"/>
         </w:rPr>
       </w:pPr>
-      <w:bookmarkStart w:id="11" w:name="_Toc307155221"/>
+      <w:bookmarkStart w:id="10" w:name="_Toc307155221"/>
     </w:p>
     <w:p>
       <w:pPr>
@@ -3988,7 +4047,7 @@
           <w:highlight w:val="yellow"/>
         </w:rPr>
       </w:pPr>
-      <w:bookmarkStart w:id="12" w:name="_Toc105357694"/>
+      <w:bookmarkStart w:id="11" w:name="_Toc105357694"/>
       <w:r>
         <w:rPr>
           <w:rFonts w:ascii="Arial" w:hAnsi="Arial" w:cs="Arial"/>
@@ -4017,8 +4076,8 @@
         </w:rPr>
         <w:t>Atores</w:t>
       </w:r>
+      <w:bookmarkEnd w:id="10"/>
       <w:bookmarkEnd w:id="11"/>
-      <w:bookmarkEnd w:id="12"/>
     </w:p>
     <w:p>
       <w:pPr>
@@ -4194,7 +4253,7 @@
           <w:highlight w:val="yellow"/>
         </w:rPr>
       </w:pPr>
-      <w:bookmarkStart w:id="13" w:name="_Toc105357695"/>
+      <w:bookmarkStart w:id="12" w:name="_Toc105357695"/>
       <w:r>
         <w:rPr>
           <w:rFonts w:ascii="Arial" w:hAnsi="Arial" w:cs="Arial"/>
@@ -4231,7 +4290,7 @@
         </w:rPr>
         <w:t>Diagrama de Caso de Uso</w:t>
       </w:r>
-      <w:bookmarkEnd w:id="13"/>
+      <w:bookmarkEnd w:id="12"/>
     </w:p>
     <w:p>
       <w:pPr>
@@ -4512,7 +4571,6 @@
               </w:rPr>
               <w:t xml:space="preserve"> – </w:t>
             </w:r>
-            <w:proofErr w:type="spellStart"/>
             <w:r>
               <w:rPr>
                 <w:rFonts w:ascii="Arial" w:hAnsi="Arial" w:cs="Arial"/>
@@ -4522,19 +4580,7 @@
                 <w:szCs w:val="20"/>
                 <w:highlight w:val="yellow"/>
               </w:rPr>
-              <w:t>Logar</w:t>
-            </w:r>
-            <w:proofErr w:type="spellEnd"/>
-            <w:r>
-              <w:rPr>
-                <w:rFonts w:ascii="Arial" w:hAnsi="Arial" w:cs="Arial"/>
-                <w:b/>
-                <w:bCs/>
-                <w:sz w:val="20"/>
-                <w:szCs w:val="20"/>
-                <w:highlight w:val="yellow"/>
-              </w:rPr>
-              <w:t xml:space="preserve"> Cliente</w:t>
+              <w:t>Logar Cliente</w:t>
             </w:r>
           </w:p>
         </w:tc>
@@ -6623,27 +6669,7 @@
                 <w:szCs w:val="20"/>
                 <w:highlight w:val="yellow"/>
               </w:rPr>
-              <w:t xml:space="preserve">O usuário pode filtrar os resultados por categoria nos </w:t>
-            </w:r>
-            <w:proofErr w:type="spellStart"/>
-            <w:r>
-              <w:rPr>
-                <w:rFonts w:ascii="Arial" w:eastAsia="Arial" w:hAnsi="Arial" w:cs="Arial"/>
-                <w:sz w:val="20"/>
-                <w:szCs w:val="20"/>
-                <w:highlight w:val="yellow"/>
-              </w:rPr>
-              <w:t>labels</w:t>
-            </w:r>
-            <w:proofErr w:type="spellEnd"/>
-            <w:r>
-              <w:rPr>
-                <w:rFonts w:ascii="Arial" w:eastAsia="Arial" w:hAnsi="Arial" w:cs="Arial"/>
-                <w:sz w:val="20"/>
-                <w:szCs w:val="20"/>
-                <w:highlight w:val="yellow"/>
-              </w:rPr>
-              <w:t xml:space="preserve"> iniciais e distância e tipo de estabelecimento nos filtros</w:t>
+              <w:t>O usuário pode filtrar os resultados por categoria nos labels iniciais e distância e tipo de estabelecimento nos filtros</w:t>
             </w:r>
             <w:r>
               <w:rPr>
@@ -9430,29 +9456,7 @@
                 <w:szCs w:val="20"/>
                 <w:highlight w:val="yellow"/>
               </w:rPr>
-              <w:t xml:space="preserve">Permite ao usuário registrar manualmente sua presença em um local, contribuindo para a atualização da lotação, por meio de escaneamento de QR </w:t>
-            </w:r>
-            <w:proofErr w:type="spellStart"/>
-            <w:r>
-              <w:rPr>
-                <w:rFonts w:ascii="Arial" w:eastAsia="Arial" w:hAnsi="Arial" w:cs="Arial"/>
-                <w:color w:val="000000" w:themeColor="text1"/>
-                <w:sz w:val="20"/>
-                <w:szCs w:val="20"/>
-                <w:highlight w:val="yellow"/>
-              </w:rPr>
-              <w:t>Code</w:t>
-            </w:r>
-            <w:proofErr w:type="spellEnd"/>
-            <w:r>
-              <w:rPr>
-                <w:rFonts w:ascii="Arial" w:eastAsia="Arial" w:hAnsi="Arial" w:cs="Arial"/>
-                <w:color w:val="000000" w:themeColor="text1"/>
-                <w:sz w:val="20"/>
-                <w:szCs w:val="20"/>
-                <w:highlight w:val="yellow"/>
-              </w:rPr>
-              <w:t xml:space="preserve"> ou confirmação direta via interface do app.</w:t>
+              <w:t>Permite ao usuário registrar manualmente sua presença em um local, contribuindo para a atualização da lotação, por meio de escaneamento de QR Code ou confirmação direta via interface do app.</w:t>
             </w:r>
           </w:p>
         </w:tc>
@@ -9764,27 +9768,7 @@
                 <w:szCs w:val="20"/>
                 <w:highlight w:val="yellow"/>
               </w:rPr>
-              <w:t xml:space="preserve">QR </w:t>
-            </w:r>
-            <w:proofErr w:type="spellStart"/>
-            <w:r>
-              <w:rPr>
-                <w:rFonts w:ascii="Arial" w:eastAsia="Arial" w:hAnsi="Arial" w:cs="Arial"/>
-                <w:sz w:val="20"/>
-                <w:szCs w:val="20"/>
-                <w:highlight w:val="yellow"/>
-              </w:rPr>
-              <w:t>Code</w:t>
-            </w:r>
-            <w:proofErr w:type="spellEnd"/>
-            <w:r>
-              <w:rPr>
-                <w:rFonts w:ascii="Arial" w:eastAsia="Arial" w:hAnsi="Arial" w:cs="Arial"/>
-                <w:sz w:val="20"/>
-                <w:szCs w:val="20"/>
-                <w:highlight w:val="yellow"/>
-              </w:rPr>
-              <w:t xml:space="preserve"> ou estar disponível para confirmação manual.</w:t>
+              <w:t>QR Code ou estar disponível para confirmação manual.</w:t>
             </w:r>
           </w:p>
           <w:p>
@@ -9983,27 +9967,7 @@
                 <w:szCs w:val="20"/>
                 <w:highlight w:val="yellow"/>
               </w:rPr>
-              <w:t xml:space="preserve">Escanear QR </w:t>
-            </w:r>
-            <w:proofErr w:type="spellStart"/>
-            <w:r>
-              <w:rPr>
-                <w:rFonts w:ascii="Arial" w:eastAsia="Arial" w:hAnsi="Arial" w:cs="Arial"/>
-                <w:sz w:val="20"/>
-                <w:szCs w:val="20"/>
-                <w:highlight w:val="yellow"/>
-              </w:rPr>
-              <w:t>Code</w:t>
-            </w:r>
-            <w:proofErr w:type="spellEnd"/>
-            <w:r>
-              <w:rPr>
-                <w:rFonts w:ascii="Arial" w:eastAsia="Arial" w:hAnsi="Arial" w:cs="Arial"/>
-                <w:sz w:val="20"/>
-                <w:szCs w:val="20"/>
-                <w:highlight w:val="yellow"/>
-              </w:rPr>
-              <w:t xml:space="preserve"> do local</w:t>
+              <w:t>Escanear QR Code do local</w:t>
             </w:r>
           </w:p>
           <w:p>
@@ -10086,27 +10050,7 @@
                 <w:szCs w:val="20"/>
                 <w:highlight w:val="yellow"/>
               </w:rPr>
-              <w:t xml:space="preserve">Se escolher QR </w:t>
-            </w:r>
-            <w:proofErr w:type="spellStart"/>
-            <w:r>
-              <w:rPr>
-                <w:rFonts w:ascii="Arial" w:eastAsia="Arial" w:hAnsi="Arial" w:cs="Arial"/>
-                <w:sz w:val="20"/>
-                <w:szCs w:val="20"/>
-                <w:highlight w:val="yellow"/>
-              </w:rPr>
-              <w:t>Code</w:t>
-            </w:r>
-            <w:proofErr w:type="spellEnd"/>
-            <w:r>
-              <w:rPr>
-                <w:rFonts w:ascii="Arial" w:eastAsia="Arial" w:hAnsi="Arial" w:cs="Arial"/>
-                <w:sz w:val="20"/>
-                <w:szCs w:val="20"/>
-                <w:highlight w:val="yellow"/>
-              </w:rPr>
-              <w:t>:</w:t>
+              <w:t>Se escolher QR Code:</w:t>
             </w:r>
           </w:p>
           <w:p>
@@ -10174,27 +10118,7 @@
                 <w:szCs w:val="20"/>
                 <w:highlight w:val="yellow"/>
               </w:rPr>
-              <w:t xml:space="preserve">QR </w:t>
-            </w:r>
-            <w:proofErr w:type="spellStart"/>
-            <w:r>
-              <w:rPr>
-                <w:rFonts w:ascii="Arial" w:eastAsia="Arial" w:hAnsi="Arial" w:cs="Arial"/>
-                <w:sz w:val="20"/>
-                <w:szCs w:val="20"/>
-                <w:highlight w:val="yellow"/>
-              </w:rPr>
-              <w:t>Code</w:t>
-            </w:r>
-            <w:proofErr w:type="spellEnd"/>
-            <w:r>
-              <w:rPr>
-                <w:rFonts w:ascii="Arial" w:eastAsia="Arial" w:hAnsi="Arial" w:cs="Arial"/>
-                <w:sz w:val="20"/>
-                <w:szCs w:val="20"/>
-                <w:highlight w:val="yellow"/>
-              </w:rPr>
-              <w:t xml:space="preserve"> (deve ser único e vinculado ao local)</w:t>
+              <w:t>QR Code (deve ser único e vinculado ao local)</w:t>
             </w:r>
           </w:p>
           <w:p>
@@ -10600,29 +10524,7 @@
                 <w:szCs w:val="20"/>
                 <w:highlight w:val="yellow"/>
               </w:rPr>
-              <w:t xml:space="preserve">Se a geolocalização não encontrar locais próximos, o sistema informa e sugere tentar mais tarde ou escanear o QR </w:t>
-            </w:r>
-            <w:proofErr w:type="spellStart"/>
-            <w:r>
-              <w:rPr>
-                <w:rFonts w:ascii="Arial" w:eastAsia="Arial" w:hAnsi="Arial" w:cs="Arial"/>
-                <w:color w:val="000000" w:themeColor="text1"/>
-                <w:sz w:val="20"/>
-                <w:szCs w:val="20"/>
-                <w:highlight w:val="yellow"/>
-              </w:rPr>
-              <w:t>Code</w:t>
-            </w:r>
-            <w:proofErr w:type="spellEnd"/>
-            <w:r>
-              <w:rPr>
-                <w:rFonts w:ascii="Arial" w:eastAsia="Arial" w:hAnsi="Arial" w:cs="Arial"/>
-                <w:color w:val="000000" w:themeColor="text1"/>
-                <w:sz w:val="20"/>
-                <w:szCs w:val="20"/>
-                <w:highlight w:val="yellow"/>
-              </w:rPr>
-              <w:t xml:space="preserve">. </w:t>
+              <w:t xml:space="preserve">Se a geolocalização não encontrar locais próximos, o sistema informa e sugere tentar mais tarde ou escanear o QR Code. </w:t>
             </w:r>
           </w:p>
         </w:tc>
@@ -10669,22 +10571,8 @@
                 <w:szCs w:val="20"/>
                 <w:highlight w:val="yellow"/>
               </w:rPr>
-              <w:t xml:space="preserve">Fluxo de Exceção (3): Local não reconhecido no QR </w:t>
-            </w:r>
-            <w:proofErr w:type="spellStart"/>
-            <w:r>
-              <w:rPr>
-                <w:rFonts w:ascii="Arial" w:eastAsia="Arial" w:hAnsi="Arial" w:cs="Arial"/>
-                <w:b/>
-                <w:bCs/>
-                <w:color w:val="000000" w:themeColor="text1"/>
-                <w:sz w:val="20"/>
-                <w:szCs w:val="20"/>
-                <w:highlight w:val="yellow"/>
-              </w:rPr>
-              <w:t>Code</w:t>
-            </w:r>
-            <w:proofErr w:type="spellEnd"/>
+              <w:t>Fluxo de Exceção (3): Local não reconhecido no QR Code</w:t>
+            </w:r>
           </w:p>
           <w:p>
             <w:pPr>
@@ -10719,29 +10607,7 @@
                 <w:szCs w:val="20"/>
                 <w:highlight w:val="yellow"/>
               </w:rPr>
-              <w:t xml:space="preserve"> Se o QR </w:t>
-            </w:r>
-            <w:proofErr w:type="spellStart"/>
-            <w:r>
-              <w:rPr>
-                <w:rFonts w:ascii="Arial" w:eastAsia="Arial" w:hAnsi="Arial" w:cs="Arial"/>
-                <w:color w:val="000000" w:themeColor="text1"/>
-                <w:sz w:val="20"/>
-                <w:szCs w:val="20"/>
-                <w:highlight w:val="yellow"/>
-              </w:rPr>
-              <w:t>Code</w:t>
-            </w:r>
-            <w:proofErr w:type="spellEnd"/>
-            <w:r>
-              <w:rPr>
-                <w:rFonts w:ascii="Arial" w:eastAsia="Arial" w:hAnsi="Arial" w:cs="Arial"/>
-                <w:color w:val="000000" w:themeColor="text1"/>
-                <w:sz w:val="20"/>
-                <w:szCs w:val="20"/>
-                <w:highlight w:val="yellow"/>
-              </w:rPr>
-              <w:t xml:space="preserve"> não corresponde a nenhum local válido o sistema exibe mensagem de erro e permite tentar novamente.</w:t>
+              <w:t xml:space="preserve"> Se o QR Code não corresponde a nenhum local válido o sistema exibe mensagem de erro e permite tentar novamente.</w:t>
             </w:r>
           </w:p>
         </w:tc>
@@ -11110,8 +10976,6 @@
                 <w:highlight w:val="yellow"/>
               </w:rPr>
             </w:pPr>
-            <w:proofErr w:type="spellStart"/>
-            <w:proofErr w:type="gramStart"/>
             <w:r>
               <w:rPr>
                 <w:rFonts w:ascii="Arial" w:eastAsia="Arial" w:hAnsi="Arial" w:cs="Arial"/>
@@ -11122,33 +10986,7 @@
                 <w:szCs w:val="20"/>
                 <w:highlight w:val="yellow"/>
               </w:rPr>
-              <w:t>Requistos</w:t>
-            </w:r>
-            <w:proofErr w:type="spellEnd"/>
-            <w:r>
-              <w:rPr>
-                <w:rFonts w:ascii="Arial" w:eastAsia="Arial" w:hAnsi="Arial" w:cs="Arial"/>
-                <w:b/>
-                <w:bCs/>
-                <w:color w:val="000000" w:themeColor="text1"/>
-                <w:sz w:val="20"/>
-                <w:szCs w:val="20"/>
-                <w:highlight w:val="yellow"/>
-              </w:rPr>
-              <w:t xml:space="preserve"> :</w:t>
-            </w:r>
-            <w:proofErr w:type="gramEnd"/>
-            <w:r>
-              <w:rPr>
-                <w:rFonts w:ascii="Arial" w:eastAsia="Arial" w:hAnsi="Arial" w:cs="Arial"/>
-                <w:b/>
-                <w:bCs/>
-                <w:color w:val="000000" w:themeColor="text1"/>
-                <w:sz w:val="20"/>
-                <w:szCs w:val="20"/>
-                <w:highlight w:val="yellow"/>
-              </w:rPr>
-              <w:t xml:space="preserve"> </w:t>
+              <w:t xml:space="preserve">Requistos : </w:t>
             </w:r>
             <w:r>
               <w:rPr>
@@ -11519,23 +11357,7 @@
           <w:rFonts w:ascii="Arial" w:eastAsia="Arial" w:hAnsi="Arial" w:cs="Arial"/>
           <w:highlight w:val="yellow"/>
         </w:rPr>
-        <w:t xml:space="preserve">Oferece duas opções naturais para o usuário: escanear QR </w:t>
-      </w:r>
-      <w:proofErr w:type="spellStart"/>
-      <w:r>
-        <w:rPr>
-          <w:rFonts w:ascii="Arial" w:eastAsia="Arial" w:hAnsi="Arial" w:cs="Arial"/>
-          <w:highlight w:val="yellow"/>
-        </w:rPr>
-        <w:t>Code</w:t>
-      </w:r>
-      <w:proofErr w:type="spellEnd"/>
-      <w:r>
-        <w:rPr>
-          <w:rFonts w:ascii="Arial" w:eastAsia="Arial" w:hAnsi="Arial" w:cs="Arial"/>
-          <w:highlight w:val="yellow"/>
-        </w:rPr>
-        <w:t xml:space="preserve"> ou confirmar manualmente.</w:t>
+        <w:t>Oferece duas opções naturais para o usuário: escanear QR Code ou confirmar manualmente.</w:t>
       </w:r>
     </w:p>
     <w:p>
@@ -11618,23 +11440,7 @@
           <w:rFonts w:ascii="Arial" w:eastAsia="Arial" w:hAnsi="Arial" w:cs="Arial"/>
           <w:highlight w:val="yellow"/>
         </w:rPr>
-        <w:t xml:space="preserve">O botão “Confirmar” e o QR </w:t>
-      </w:r>
-      <w:proofErr w:type="spellStart"/>
-      <w:r>
-        <w:rPr>
-          <w:rFonts w:ascii="Arial" w:eastAsia="Arial" w:hAnsi="Arial" w:cs="Arial"/>
-          <w:highlight w:val="yellow"/>
-        </w:rPr>
-        <w:t>Code</w:t>
-      </w:r>
-      <w:proofErr w:type="spellEnd"/>
-      <w:r>
-        <w:rPr>
-          <w:rFonts w:ascii="Arial" w:eastAsia="Arial" w:hAnsi="Arial" w:cs="Arial"/>
-          <w:highlight w:val="yellow"/>
-        </w:rPr>
-        <w:t xml:space="preserve"> são autoexplicativos e visuais.</w:t>
+        <w:t>O botão “Confirmar” e o QR Code são autoexplicativos e visuais.</w:t>
       </w:r>
     </w:p>
     <w:p>
@@ -13476,27 +13282,7 @@
           <w:szCs w:val="28"/>
           <w:highlight w:val="yellow"/>
         </w:rPr>
-        <w:t>1. Lei de Jakob (</w:t>
-      </w:r>
-      <w:proofErr w:type="spellStart"/>
-      <w:r>
-        <w:rPr>
-          <w:rFonts w:ascii="Arial" w:eastAsia="Arial" w:hAnsi="Arial" w:cs="Arial"/>
-          <w:sz w:val="28"/>
-          <w:szCs w:val="28"/>
-          <w:highlight w:val="yellow"/>
-        </w:rPr>
-        <w:t>Jakob’s</w:t>
-      </w:r>
-      <w:proofErr w:type="spellEnd"/>
-      <w:r>
-        <w:rPr>
-          <w:rFonts w:ascii="Arial" w:eastAsia="Arial" w:hAnsi="Arial" w:cs="Arial"/>
-          <w:sz w:val="28"/>
-          <w:szCs w:val="28"/>
-          <w:highlight w:val="yellow"/>
-        </w:rPr>
-        <w:t xml:space="preserve"> Law)</w:t>
+        <w:t>1. Lei de Jakob (Jakob’s Law)</w:t>
       </w:r>
     </w:p>
     <w:p>
@@ -13560,23 +13346,7 @@
           <w:rFonts w:ascii="Arial" w:eastAsia="Arial" w:hAnsi="Arial" w:cs="Arial"/>
           <w:highlight w:val="yellow"/>
         </w:rPr>
-        <w:t xml:space="preserve"> (home, localização, favoritos, menu): isso segue a estrutura de navegação usada em apps amplamente conhecidos, como </w:t>
-      </w:r>
-      <w:proofErr w:type="spellStart"/>
-      <w:r>
-        <w:rPr>
-          <w:rFonts w:ascii="Arial" w:eastAsia="Arial" w:hAnsi="Arial" w:cs="Arial"/>
-          <w:highlight w:val="yellow"/>
-        </w:rPr>
-        <w:t>iFood</w:t>
-      </w:r>
-      <w:proofErr w:type="spellEnd"/>
-      <w:r>
-        <w:rPr>
-          <w:rFonts w:ascii="Arial" w:eastAsia="Arial" w:hAnsi="Arial" w:cs="Arial"/>
-          <w:highlight w:val="yellow"/>
-        </w:rPr>
-        <w:t>, Instagram, Google Maps.</w:t>
+        <w:t xml:space="preserve"> (home, localização, favoritos, menu): isso segue a estrutura de navegação usada em apps amplamente conhecidos, como iFood, Instagram, Google Maps.</w:t>
       </w:r>
     </w:p>
     <w:p>
@@ -13627,47 +13397,7 @@
           <w:szCs w:val="24"/>
           <w:highlight w:val="yellow"/>
         </w:rPr>
-        <w:t xml:space="preserve">2. Lei de </w:t>
-      </w:r>
-      <w:proofErr w:type="spellStart"/>
-      <w:r>
-        <w:rPr>
-          <w:rFonts w:ascii="Arial" w:eastAsia="Arial" w:hAnsi="Arial" w:cs="Arial"/>
-          <w:sz w:val="24"/>
-          <w:szCs w:val="24"/>
-          <w:highlight w:val="yellow"/>
-        </w:rPr>
-        <w:t>Hick</w:t>
-      </w:r>
-      <w:proofErr w:type="spellEnd"/>
-      <w:r>
-        <w:rPr>
-          <w:rFonts w:ascii="Arial" w:eastAsia="Arial" w:hAnsi="Arial" w:cs="Arial"/>
-          <w:sz w:val="24"/>
-          <w:szCs w:val="24"/>
-          <w:highlight w:val="yellow"/>
-        </w:rPr>
-        <w:t xml:space="preserve"> (</w:t>
-      </w:r>
-      <w:proofErr w:type="spellStart"/>
-      <w:r>
-        <w:rPr>
-          <w:rFonts w:ascii="Arial" w:eastAsia="Arial" w:hAnsi="Arial" w:cs="Arial"/>
-          <w:sz w:val="24"/>
-          <w:szCs w:val="24"/>
-          <w:highlight w:val="yellow"/>
-        </w:rPr>
-        <w:t>Hick’s</w:t>
-      </w:r>
-      <w:proofErr w:type="spellEnd"/>
-      <w:r>
-        <w:rPr>
-          <w:rFonts w:ascii="Arial" w:eastAsia="Arial" w:hAnsi="Arial" w:cs="Arial"/>
-          <w:sz w:val="24"/>
-          <w:szCs w:val="24"/>
-          <w:highlight w:val="yellow"/>
-        </w:rPr>
-        <w:t xml:space="preserve"> Law)</w:t>
+        <w:t>2. Lei de Hick (Hick’s Law)</w:t>
       </w:r>
     </w:p>
     <w:p>
@@ -13756,19 +13486,8 @@
           <w:iCs/>
           <w:highlight w:val="yellow"/>
         </w:rPr>
-        <w:t xml:space="preserve">Escanear QR </w:t>
-      </w:r>
-      <w:proofErr w:type="spellStart"/>
-      <w:r>
-        <w:rPr>
-          <w:rFonts w:ascii="Arial" w:eastAsia="Arial" w:hAnsi="Arial" w:cs="Arial"/>
-          <w:i/>
-          <w:iCs/>
-          <w:highlight w:val="yellow"/>
-        </w:rPr>
-        <w:t>Code</w:t>
-      </w:r>
-      <w:proofErr w:type="spellEnd"/>
+        <w:t>Escanear QR Code</w:t>
+      </w:r>
       <w:r>
         <w:rPr>
           <w:rFonts w:ascii="Arial" w:eastAsia="Arial" w:hAnsi="Arial" w:cs="Arial"/>
@@ -13857,47 +13576,7 @@
           <w:szCs w:val="24"/>
           <w:highlight w:val="yellow"/>
         </w:rPr>
-        <w:t xml:space="preserve">3. Lei de </w:t>
-      </w:r>
-      <w:proofErr w:type="spellStart"/>
-      <w:r>
-        <w:rPr>
-          <w:rFonts w:ascii="Arial" w:eastAsia="Arial" w:hAnsi="Arial" w:cs="Arial"/>
-          <w:sz w:val="24"/>
-          <w:szCs w:val="24"/>
-          <w:highlight w:val="yellow"/>
-        </w:rPr>
-        <w:t>Fitts</w:t>
-      </w:r>
-      <w:proofErr w:type="spellEnd"/>
-      <w:r>
-        <w:rPr>
-          <w:rFonts w:ascii="Arial" w:eastAsia="Arial" w:hAnsi="Arial" w:cs="Arial"/>
-          <w:sz w:val="24"/>
-          <w:szCs w:val="24"/>
-          <w:highlight w:val="yellow"/>
-        </w:rPr>
-        <w:t xml:space="preserve"> (</w:t>
-      </w:r>
-      <w:proofErr w:type="spellStart"/>
-      <w:r>
-        <w:rPr>
-          <w:rFonts w:ascii="Arial" w:eastAsia="Arial" w:hAnsi="Arial" w:cs="Arial"/>
-          <w:sz w:val="24"/>
-          <w:szCs w:val="24"/>
-          <w:highlight w:val="yellow"/>
-        </w:rPr>
-        <w:t>Fitts’s</w:t>
-      </w:r>
-      <w:proofErr w:type="spellEnd"/>
-      <w:r>
-        <w:rPr>
-          <w:rFonts w:ascii="Arial" w:eastAsia="Arial" w:hAnsi="Arial" w:cs="Arial"/>
-          <w:sz w:val="24"/>
-          <w:szCs w:val="24"/>
-          <w:highlight w:val="yellow"/>
-        </w:rPr>
-        <w:t xml:space="preserve"> Law)</w:t>
+        <w:t>3. Lei de Fitts (Fitts’s Law)</w:t>
       </w:r>
     </w:p>
     <w:p>
@@ -15159,7 +14838,6 @@
           <w:highlight w:val="yellow"/>
         </w:rPr>
       </w:pPr>
-      <w:proofErr w:type="spellStart"/>
       <w:r>
         <w:rPr>
           <w:rFonts w:ascii="Arial" w:eastAsia="Arial" w:hAnsi="Arial" w:cs="Arial"/>
@@ -15169,7 +14847,6 @@
         </w:rPr>
         <w:t>Placeholder</w:t>
       </w:r>
-      <w:proofErr w:type="spellEnd"/>
       <w:r>
         <w:rPr>
           <w:rFonts w:ascii="Arial" w:eastAsia="Arial" w:hAnsi="Arial" w:cs="Arial"/>
@@ -15177,47 +14854,7 @@
           <w:bCs/>
           <w:highlight w:val="yellow"/>
         </w:rPr>
-        <w:t xml:space="preserve">, </w:t>
-      </w:r>
-      <w:proofErr w:type="spellStart"/>
-      <w:r>
-        <w:rPr>
-          <w:rFonts w:ascii="Arial" w:eastAsia="Arial" w:hAnsi="Arial" w:cs="Arial"/>
-          <w:b/>
-          <w:bCs/>
-          <w:highlight w:val="yellow"/>
-        </w:rPr>
-        <w:t>Icons</w:t>
-      </w:r>
-      <w:proofErr w:type="spellEnd"/>
-      <w:r>
-        <w:rPr>
-          <w:rFonts w:ascii="Arial" w:eastAsia="Arial" w:hAnsi="Arial" w:cs="Arial"/>
-          <w:b/>
-          <w:bCs/>
-          <w:highlight w:val="yellow"/>
-        </w:rPr>
-        <w:t xml:space="preserve">, </w:t>
-      </w:r>
-      <w:proofErr w:type="spellStart"/>
-      <w:r>
-        <w:rPr>
-          <w:rFonts w:ascii="Arial" w:eastAsia="Arial" w:hAnsi="Arial" w:cs="Arial"/>
-          <w:b/>
-          <w:bCs/>
-          <w:highlight w:val="yellow"/>
-        </w:rPr>
-        <w:t>Labels</w:t>
-      </w:r>
-      <w:proofErr w:type="spellEnd"/>
-      <w:r>
-        <w:rPr>
-          <w:rFonts w:ascii="Arial" w:eastAsia="Arial" w:hAnsi="Arial" w:cs="Arial"/>
-          <w:b/>
-          <w:bCs/>
-          <w:highlight w:val="yellow"/>
-        </w:rPr>
-        <w:t xml:space="preserve"> e Alerts</w:t>
+        <w:t>, Icons, Labels e Alerts</w:t>
       </w:r>
     </w:p>
     <w:p>
@@ -15784,9 +15421,9 @@
           <w:lang w:val="pt-BR"/>
         </w:rPr>
       </w:pPr>
-      <w:bookmarkStart w:id="14" w:name="_Toc198053005"/>
-      <w:bookmarkStart w:id="15" w:name="_Toc335578750"/>
-      <w:bookmarkStart w:id="16" w:name="_Toc105357697"/>
+      <w:bookmarkStart w:id="13" w:name="_Toc198053005"/>
+      <w:bookmarkStart w:id="14" w:name="_Toc335578750"/>
+      <w:bookmarkStart w:id="15" w:name="_Toc105357697"/>
       <w:r>
         <w:rPr>
           <w:rFonts w:cs="Arial"/>
@@ -15796,9 +15433,9 @@
         <w:lastRenderedPageBreak/>
         <w:t>REFERÊNCIAS</w:t>
       </w:r>
+      <w:bookmarkEnd w:id="13"/>
       <w:bookmarkEnd w:id="14"/>
       <w:bookmarkEnd w:id="15"/>
-      <w:bookmarkEnd w:id="16"/>
       <w:r>
         <w:rPr>
           <w:rFonts w:cs="Arial"/>
@@ -15830,108 +15467,8 @@
           <w:rFonts w:ascii="Arial" w:hAnsi="Arial" w:cs="Arial"/>
           <w:highlight w:val="yellow"/>
         </w:rPr>
-        <w:t xml:space="preserve">Login </w:t>
-      </w:r>
-      <w:proofErr w:type="spellStart"/>
-      <w:r>
-        <w:rPr>
-          <w:rStyle w:val="nfase"/>
-          <w:rFonts w:ascii="Arial" w:hAnsi="Arial" w:cs="Arial"/>
-          <w:highlight w:val="yellow"/>
-        </w:rPr>
-        <w:t>is</w:t>
-      </w:r>
-      <w:proofErr w:type="spellEnd"/>
-      <w:r>
-        <w:rPr>
-          <w:rStyle w:val="nfase"/>
-          <w:rFonts w:ascii="Arial" w:hAnsi="Arial" w:cs="Arial"/>
-          <w:highlight w:val="yellow"/>
-        </w:rPr>
-        <w:t xml:space="preserve"> </w:t>
-      </w:r>
-      <w:proofErr w:type="spellStart"/>
-      <w:r>
-        <w:rPr>
-          <w:rStyle w:val="nfase"/>
-          <w:rFonts w:ascii="Arial" w:hAnsi="Arial" w:cs="Arial"/>
-          <w:highlight w:val="yellow"/>
-        </w:rPr>
-        <w:t>one</w:t>
-      </w:r>
-      <w:proofErr w:type="spellEnd"/>
-      <w:r>
-        <w:rPr>
-          <w:rStyle w:val="nfase"/>
-          <w:rFonts w:ascii="Arial" w:hAnsi="Arial" w:cs="Arial"/>
-          <w:highlight w:val="yellow"/>
-        </w:rPr>
-        <w:t xml:space="preserve"> </w:t>
-      </w:r>
-      <w:proofErr w:type="spellStart"/>
-      <w:r>
-        <w:rPr>
-          <w:rStyle w:val="nfase"/>
-          <w:rFonts w:ascii="Arial" w:hAnsi="Arial" w:cs="Arial"/>
-          <w:highlight w:val="yellow"/>
-        </w:rPr>
-        <w:t>of</w:t>
-      </w:r>
-      <w:proofErr w:type="spellEnd"/>
-      <w:r>
-        <w:rPr>
-          <w:rStyle w:val="nfase"/>
-          <w:rFonts w:ascii="Arial" w:hAnsi="Arial" w:cs="Arial"/>
-          <w:highlight w:val="yellow"/>
-        </w:rPr>
-        <w:t xml:space="preserve"> </w:t>
-      </w:r>
-      <w:proofErr w:type="spellStart"/>
-      <w:r>
-        <w:rPr>
-          <w:rStyle w:val="nfase"/>
-          <w:rFonts w:ascii="Arial" w:hAnsi="Arial" w:cs="Arial"/>
-          <w:highlight w:val="yellow"/>
-        </w:rPr>
-        <w:t>the</w:t>
-      </w:r>
-      <w:proofErr w:type="spellEnd"/>
-      <w:r>
-        <w:rPr>
-          <w:rStyle w:val="nfase"/>
-          <w:rFonts w:ascii="Arial" w:hAnsi="Arial" w:cs="Arial"/>
-          <w:highlight w:val="yellow"/>
-        </w:rPr>
-        <w:t xml:space="preserve"> crucial </w:t>
-      </w:r>
-      <w:proofErr w:type="spellStart"/>
-      <w:r>
-        <w:rPr>
-          <w:rStyle w:val="nfase"/>
-          <w:rFonts w:ascii="Arial" w:hAnsi="Arial" w:cs="Arial"/>
-          <w:highlight w:val="yellow"/>
-        </w:rPr>
-        <w:t>screens</w:t>
-      </w:r>
-      <w:proofErr w:type="spellEnd"/>
-      <w:r>
-        <w:rPr>
-          <w:rStyle w:val="nfase"/>
-          <w:rFonts w:ascii="Arial" w:hAnsi="Arial" w:cs="Arial"/>
-          <w:highlight w:val="yellow"/>
-        </w:rPr>
-        <w:t xml:space="preserve"> for </w:t>
-      </w:r>
-      <w:proofErr w:type="spellStart"/>
-      <w:r>
-        <w:rPr>
-          <w:rStyle w:val="nfase"/>
-          <w:rFonts w:ascii="Arial" w:hAnsi="Arial" w:cs="Arial"/>
-          <w:highlight w:val="yellow"/>
-        </w:rPr>
-        <w:t>almost</w:t>
-      </w:r>
-      <w:proofErr w:type="spellEnd"/>
+        <w:t>Login is one of the crucial screens for almost</w:t>
+      </w:r>
       <w:r>
         <w:rPr>
           <w:rFonts w:ascii="Arial" w:hAnsi="Arial" w:cs="Arial"/>
@@ -16026,48 +15563,14 @@
           <w:rFonts w:ascii="Arial" w:hAnsi="Arial" w:cs="Arial"/>
           <w:highlight w:val="yellow"/>
         </w:rPr>
-        <w:t xml:space="preserve">Design System </w:t>
-      </w:r>
-      <w:proofErr w:type="spellStart"/>
-      <w:r>
-        <w:rPr>
-          <w:rStyle w:val="nfase"/>
-          <w:rFonts w:ascii="Arial" w:hAnsi="Arial" w:cs="Arial"/>
-          <w:highlight w:val="yellow"/>
-        </w:rPr>
-        <w:t>Template</w:t>
-      </w:r>
-      <w:proofErr w:type="spellEnd"/>
-      <w:r>
-        <w:rPr>
-          <w:rStyle w:val="nfase"/>
-          <w:rFonts w:ascii="Arial" w:hAnsi="Arial" w:cs="Arial"/>
-          <w:highlight w:val="yellow"/>
-        </w:rPr>
-        <w:t xml:space="preserve"> (Community)</w:t>
-      </w:r>
-      <w:r>
-        <w:rPr>
-          <w:rFonts w:ascii="Arial" w:hAnsi="Arial" w:cs="Arial"/>
-          <w:highlight w:val="yellow"/>
-        </w:rPr>
-        <w:t xml:space="preserve">. </w:t>
-      </w:r>
-      <w:proofErr w:type="spellStart"/>
-      <w:r>
-        <w:rPr>
-          <w:rFonts w:ascii="Arial" w:hAnsi="Arial" w:cs="Arial"/>
-          <w:highlight w:val="yellow"/>
-        </w:rPr>
-        <w:t>Figma</w:t>
-      </w:r>
-      <w:proofErr w:type="spellEnd"/>
-      <w:r>
-        <w:rPr>
-          <w:rFonts w:ascii="Arial" w:hAnsi="Arial" w:cs="Arial"/>
-          <w:highlight w:val="yellow"/>
-        </w:rPr>
-        <w:t xml:space="preserve">, [s.d.]. Disponível em: </w:t>
+        <w:t>Design System Template (Community)</w:t>
+      </w:r>
+      <w:r>
+        <w:rPr>
+          <w:rFonts w:ascii="Arial" w:hAnsi="Arial" w:cs="Arial"/>
+          <w:highlight w:val="yellow"/>
+        </w:rPr>
+        <w:t xml:space="preserve">. Figma, [s.d.]. Disponível em: </w:t>
       </w:r>
       <w:hyperlink r:id="rId33" w:tgtFrame="_new" w:history="1">
         <w:r>
@@ -16102,46 +15605,20 @@
         </w:rPr>
         <w:t xml:space="preserve">FIGMA. </w:t>
       </w:r>
-      <w:proofErr w:type="spellStart"/>
       <w:r>
         <w:rPr>
           <w:rStyle w:val="nfase"/>
           <w:rFonts w:ascii="Arial" w:hAnsi="Arial" w:cs="Arial"/>
           <w:highlight w:val="yellow"/>
         </w:rPr>
-        <w:t>Bootstrap</w:t>
-      </w:r>
-      <w:proofErr w:type="spellEnd"/>
-      <w:r>
-        <w:rPr>
-          <w:rStyle w:val="nfase"/>
-          <w:rFonts w:ascii="Arial" w:hAnsi="Arial" w:cs="Arial"/>
-          <w:highlight w:val="yellow"/>
-        </w:rPr>
-        <w:t xml:space="preserve"> 5 UI Kit (Community)</w:t>
-      </w:r>
-      <w:r>
-        <w:rPr>
-          <w:rFonts w:ascii="Arial" w:hAnsi="Arial" w:cs="Arial"/>
-          <w:highlight w:val="yellow"/>
-        </w:rPr>
-        <w:t xml:space="preserve">. </w:t>
-      </w:r>
-      <w:proofErr w:type="spellStart"/>
-      <w:r>
-        <w:rPr>
-          <w:rFonts w:ascii="Arial" w:hAnsi="Arial" w:cs="Arial"/>
-          <w:highlight w:val="yellow"/>
-        </w:rPr>
-        <w:t>Figma</w:t>
-      </w:r>
-      <w:proofErr w:type="spellEnd"/>
-      <w:r>
-        <w:rPr>
-          <w:rFonts w:ascii="Arial" w:hAnsi="Arial" w:cs="Arial"/>
-          <w:highlight w:val="yellow"/>
-        </w:rPr>
-        <w:t xml:space="preserve">, [s.d.]. Disponível em: </w:t>
+        <w:t>Bootstrap 5 UI Kit (Community)</w:t>
+      </w:r>
+      <w:r>
+        <w:rPr>
+          <w:rFonts w:ascii="Arial" w:hAnsi="Arial" w:cs="Arial"/>
+          <w:highlight w:val="yellow"/>
+        </w:rPr>
+        <w:t xml:space="preserve">. Figma, [s.d.]. Disponível em: </w:t>
       </w:r>
       <w:hyperlink r:id="rId34" w:tgtFrame="_new" w:history="1">
         <w:r>
@@ -16176,23 +15653,13 @@
         </w:rPr>
         <w:t xml:space="preserve">MATERIAL DESIGN. </w:t>
       </w:r>
-      <w:proofErr w:type="spellStart"/>
       <w:r>
         <w:rPr>
           <w:rStyle w:val="nfase"/>
           <w:rFonts w:ascii="Arial" w:hAnsi="Arial" w:cs="Arial"/>
           <w:highlight w:val="yellow"/>
         </w:rPr>
-        <w:t>Icons</w:t>
-      </w:r>
-      <w:proofErr w:type="spellEnd"/>
-      <w:r>
-        <w:rPr>
-          <w:rStyle w:val="nfase"/>
-          <w:rFonts w:ascii="Arial" w:hAnsi="Arial" w:cs="Arial"/>
-          <w:highlight w:val="yellow"/>
-        </w:rPr>
-        <w:t xml:space="preserve"> overview</w:t>
+        <w:t>Icons overview</w:t>
       </w:r>
       <w:r>
         <w:rPr>
@@ -16247,23 +15714,7 @@
           <w:rFonts w:ascii="Arial" w:hAnsi="Arial" w:cs="Arial"/>
           <w:highlight w:val="yellow"/>
         </w:rPr>
-        <w:t xml:space="preserve">. </w:t>
-      </w:r>
-      <w:proofErr w:type="spellStart"/>
-      <w:r>
-        <w:rPr>
-          <w:rFonts w:ascii="Arial" w:hAnsi="Arial" w:cs="Arial"/>
-          <w:highlight w:val="yellow"/>
-        </w:rPr>
-        <w:t>Figma</w:t>
-      </w:r>
-      <w:proofErr w:type="spellEnd"/>
-      <w:r>
-        <w:rPr>
-          <w:rFonts w:ascii="Arial" w:hAnsi="Arial" w:cs="Arial"/>
-          <w:highlight w:val="yellow"/>
-        </w:rPr>
-        <w:t xml:space="preserve">, [s.d.]. Disponível em: </w:t>
+        <w:t xml:space="preserve">. Figma, [s.d.]. Disponível em: </w:t>
       </w:r>
       <w:hyperlink r:id="rId36" w:tgtFrame="_new" w:history="1">
         <w:r>
@@ -16304,58 +15755,14 @@
           <w:rFonts w:ascii="Arial" w:hAnsi="Arial" w:cs="Arial"/>
           <w:highlight w:val="yellow"/>
         </w:rPr>
-        <w:t xml:space="preserve">10 </w:t>
-      </w:r>
-      <w:proofErr w:type="spellStart"/>
-      <w:r>
-        <w:rPr>
-          <w:rStyle w:val="nfase"/>
-          <w:rFonts w:ascii="Arial" w:hAnsi="Arial" w:cs="Arial"/>
-          <w:highlight w:val="yellow"/>
-        </w:rPr>
-        <w:t>great</w:t>
-      </w:r>
-      <w:proofErr w:type="spellEnd"/>
-      <w:r>
-        <w:rPr>
-          <w:rStyle w:val="nfase"/>
-          <w:rFonts w:ascii="Arial" w:hAnsi="Arial" w:cs="Arial"/>
-          <w:highlight w:val="yellow"/>
-        </w:rPr>
-        <w:t xml:space="preserve"> sites for UI design </w:t>
-      </w:r>
-      <w:proofErr w:type="spellStart"/>
-      <w:r>
-        <w:rPr>
-          <w:rStyle w:val="nfase"/>
-          <w:rFonts w:ascii="Arial" w:hAnsi="Arial" w:cs="Arial"/>
-          <w:highlight w:val="yellow"/>
-        </w:rPr>
-        <w:t>patterns</w:t>
-      </w:r>
-      <w:proofErr w:type="spellEnd"/>
-      <w:r>
-        <w:rPr>
-          <w:rFonts w:ascii="Arial" w:hAnsi="Arial" w:cs="Arial"/>
-          <w:highlight w:val="yellow"/>
-        </w:rPr>
-        <w:t xml:space="preserve">. </w:t>
-      </w:r>
-      <w:proofErr w:type="spellStart"/>
-      <w:r>
-        <w:rPr>
-          <w:rFonts w:ascii="Arial" w:hAnsi="Arial" w:cs="Arial"/>
-          <w:highlight w:val="yellow"/>
-        </w:rPr>
-        <w:t>Interaction</w:t>
-      </w:r>
-      <w:proofErr w:type="spellEnd"/>
-      <w:r>
-        <w:rPr>
-          <w:rFonts w:ascii="Arial" w:hAnsi="Arial" w:cs="Arial"/>
-          <w:highlight w:val="yellow"/>
-        </w:rPr>
-        <w:t xml:space="preserve"> Design, [s.d.]. Disponível em: </w:t>
+        <w:t>10 great sites for UI design patterns</w:t>
+      </w:r>
+      <w:r>
+        <w:rPr>
+          <w:rFonts w:ascii="Arial" w:hAnsi="Arial" w:cs="Arial"/>
+          <w:highlight w:val="yellow"/>
+        </w:rPr>
+        <w:t xml:space="preserve">. Interaction Design, [s.d.]. Disponível em: </w:t>
       </w:r>
       <w:hyperlink r:id="rId37" w:tgtFrame="_new" w:history="1">
         <w:r>
@@ -16403,23 +15810,7 @@
           <w:rFonts w:ascii="Arial" w:hAnsi="Arial" w:cs="Arial"/>
           <w:highlight w:val="yellow"/>
         </w:rPr>
-        <w:t xml:space="preserve">. </w:t>
-      </w:r>
-      <w:proofErr w:type="spellStart"/>
-      <w:r>
-        <w:rPr>
-          <w:rFonts w:ascii="Arial" w:hAnsi="Arial" w:cs="Arial"/>
-          <w:highlight w:val="yellow"/>
-        </w:rPr>
-        <w:t>MyColor</w:t>
-      </w:r>
-      <w:proofErr w:type="spellEnd"/>
-      <w:r>
-        <w:rPr>
-          <w:rFonts w:ascii="Arial" w:hAnsi="Arial" w:cs="Arial"/>
-          <w:highlight w:val="yellow"/>
-        </w:rPr>
-        <w:t xml:space="preserve">, [s.d.]. Disponível em: </w:t>
+        <w:t xml:space="preserve">. MyColor, [s.d.]. Disponível em: </w:t>
       </w:r>
       <w:hyperlink r:id="rId38" w:tgtFrame="_new" w:history="1">
         <w:r>
@@ -16454,46 +15845,20 @@
         </w:rPr>
         <w:t xml:space="preserve">UI PATTERNS. </w:t>
       </w:r>
-      <w:proofErr w:type="spellStart"/>
       <w:r>
         <w:rPr>
           <w:rStyle w:val="nfase"/>
           <w:rFonts w:ascii="Arial" w:hAnsi="Arial" w:cs="Arial"/>
           <w:highlight w:val="yellow"/>
         </w:rPr>
-        <w:t>Getting</w:t>
-      </w:r>
-      <w:proofErr w:type="spellEnd"/>
-      <w:r>
-        <w:rPr>
-          <w:rStyle w:val="nfase"/>
-          <w:rFonts w:ascii="Arial" w:hAnsi="Arial" w:cs="Arial"/>
-          <w:highlight w:val="yellow"/>
-        </w:rPr>
-        <w:t xml:space="preserve"> Input</w:t>
-      </w:r>
-      <w:r>
-        <w:rPr>
-          <w:rFonts w:ascii="Arial" w:hAnsi="Arial" w:cs="Arial"/>
-          <w:highlight w:val="yellow"/>
-        </w:rPr>
-        <w:t xml:space="preserve">. UI </w:t>
-      </w:r>
-      <w:proofErr w:type="spellStart"/>
-      <w:r>
-        <w:rPr>
-          <w:rFonts w:ascii="Arial" w:hAnsi="Arial" w:cs="Arial"/>
-          <w:highlight w:val="yellow"/>
-        </w:rPr>
-        <w:t>Patterns</w:t>
-      </w:r>
-      <w:proofErr w:type="spellEnd"/>
-      <w:r>
-        <w:rPr>
-          <w:rFonts w:ascii="Arial" w:hAnsi="Arial" w:cs="Arial"/>
-          <w:highlight w:val="yellow"/>
-        </w:rPr>
-        <w:t xml:space="preserve">, [s.d.]. Disponível em: </w:t>
+        <w:t>Getting Input</w:t>
+      </w:r>
+      <w:r>
+        <w:rPr>
+          <w:rFonts w:ascii="Arial" w:hAnsi="Arial" w:cs="Arial"/>
+          <w:highlight w:val="yellow"/>
+        </w:rPr>
+        <w:t xml:space="preserve">. UI Patterns, [s.d.]. Disponível em: </w:t>
       </w:r>
       <w:hyperlink r:id="rId39" w:tgtFrame="_new" w:history="1">
         <w:r>
@@ -16534,40 +15899,14 @@
           <w:rFonts w:ascii="Arial" w:hAnsi="Arial" w:cs="Arial"/>
           <w:highlight w:val="yellow"/>
         </w:rPr>
-        <w:t xml:space="preserve">File Upload UI </w:t>
-      </w:r>
-      <w:proofErr w:type="spellStart"/>
-      <w:r>
-        <w:rPr>
-          <w:rStyle w:val="nfase"/>
-          <w:rFonts w:ascii="Arial" w:hAnsi="Arial" w:cs="Arial"/>
-          <w:highlight w:val="yellow"/>
-        </w:rPr>
-        <w:t>Challenges</w:t>
-      </w:r>
-      <w:proofErr w:type="spellEnd"/>
-      <w:r>
-        <w:rPr>
-          <w:rFonts w:ascii="Arial" w:hAnsi="Arial" w:cs="Arial"/>
-          <w:highlight w:val="yellow"/>
-        </w:rPr>
-        <w:t xml:space="preserve">. </w:t>
-      </w:r>
-      <w:proofErr w:type="spellStart"/>
-      <w:r>
-        <w:rPr>
-          <w:rFonts w:ascii="Arial" w:hAnsi="Arial" w:cs="Arial"/>
-          <w:highlight w:val="yellow"/>
-        </w:rPr>
-        <w:t>Collect</w:t>
-      </w:r>
-      <w:proofErr w:type="spellEnd"/>
-      <w:r>
-        <w:rPr>
-          <w:rFonts w:ascii="Arial" w:hAnsi="Arial" w:cs="Arial"/>
-          <w:highlight w:val="yellow"/>
-        </w:rPr>
-        <w:t xml:space="preserve"> UI, [s.d.]. Disponível em: </w:t>
+        <w:t>File Upload UI Challenges</w:t>
+      </w:r>
+      <w:r>
+        <w:rPr>
+          <w:rFonts w:ascii="Arial" w:hAnsi="Arial" w:cs="Arial"/>
+          <w:highlight w:val="yellow"/>
+        </w:rPr>
+        <w:t xml:space="preserve">. Collect UI, [s.d.]. Disponível em: </w:t>
       </w:r>
       <w:hyperlink r:id="rId40" w:tgtFrame="_new" w:history="1">
         <w:r>
@@ -16615,23 +15954,7 @@
           <w:rFonts w:ascii="Arial" w:hAnsi="Arial" w:cs="Arial"/>
           <w:highlight w:val="yellow"/>
         </w:rPr>
-        <w:t xml:space="preserve">. </w:t>
-      </w:r>
-      <w:proofErr w:type="spellStart"/>
-      <w:r>
-        <w:rPr>
-          <w:rFonts w:ascii="Arial" w:hAnsi="Arial" w:cs="Arial"/>
-          <w:highlight w:val="yellow"/>
-        </w:rPr>
-        <w:t>IEBSchool</w:t>
-      </w:r>
-      <w:proofErr w:type="spellEnd"/>
-      <w:r>
-        <w:rPr>
-          <w:rFonts w:ascii="Arial" w:hAnsi="Arial" w:cs="Arial"/>
-          <w:highlight w:val="yellow"/>
-        </w:rPr>
-        <w:t>, [s.d.]. Disponível em: https://www.iebschool.com/blog/ferramentas-prototipagem-ux-usabilidade-web-experiencia-usuario/. Acesso em: 14 jun. 2025.</w:t>
+        <w:t>. IEBSchool, [s.d.]. Disponível em: https://www.iebschool.com/blog/ferramentas-prototipagem-ux-usabilidade-web-experiencia-usuario/. Acesso em: 14 jun. 2025.</w:t>
       </w:r>
     </w:p>
     <w:p>
@@ -16649,46 +15972,20 @@
         </w:rPr>
         <w:t xml:space="preserve">PROPORTIO. </w:t>
       </w:r>
-      <w:proofErr w:type="spellStart"/>
       <w:r>
         <w:rPr>
           <w:rStyle w:val="nfase"/>
           <w:rFonts w:ascii="Arial" w:hAnsi="Arial" w:cs="Arial"/>
           <w:highlight w:val="yellow"/>
         </w:rPr>
-        <w:t>Proportio</w:t>
-      </w:r>
-      <w:proofErr w:type="spellEnd"/>
-      <w:r>
-        <w:rPr>
-          <w:rStyle w:val="nfase"/>
-          <w:rFonts w:ascii="Arial" w:hAnsi="Arial" w:cs="Arial"/>
-          <w:highlight w:val="yellow"/>
-        </w:rPr>
-        <w:t xml:space="preserve"> App</w:t>
-      </w:r>
-      <w:r>
-        <w:rPr>
-          <w:rFonts w:ascii="Arial" w:hAnsi="Arial" w:cs="Arial"/>
-          <w:highlight w:val="yellow"/>
-        </w:rPr>
-        <w:t xml:space="preserve">. </w:t>
-      </w:r>
-      <w:proofErr w:type="spellStart"/>
-      <w:r>
-        <w:rPr>
-          <w:rFonts w:ascii="Arial" w:hAnsi="Arial" w:cs="Arial"/>
-          <w:highlight w:val="yellow"/>
-        </w:rPr>
-        <w:t>Proportio</w:t>
-      </w:r>
-      <w:proofErr w:type="spellEnd"/>
-      <w:r>
-        <w:rPr>
-          <w:rFonts w:ascii="Arial" w:hAnsi="Arial" w:cs="Arial"/>
-          <w:highlight w:val="yellow"/>
-        </w:rPr>
-        <w:t xml:space="preserve">, [s.d.]. Disponível em: </w:t>
+        <w:t>Proportio App</w:t>
+      </w:r>
+      <w:r>
+        <w:rPr>
+          <w:rFonts w:ascii="Arial" w:hAnsi="Arial" w:cs="Arial"/>
+          <w:highlight w:val="yellow"/>
+        </w:rPr>
+        <w:t xml:space="preserve">. Proportio, [s.d.]. Disponível em: </w:t>
       </w:r>
       <w:hyperlink r:id="rId41" w:tgtFrame="_new" w:history="1">
         <w:r>
@@ -16724,82 +16021,20 @@
         <w:lastRenderedPageBreak/>
         <w:t xml:space="preserve">UX DESIGN. </w:t>
       </w:r>
-      <w:proofErr w:type="spellStart"/>
       <w:r>
         <w:rPr>
           <w:rStyle w:val="nfase"/>
           <w:rFonts w:ascii="Arial" w:hAnsi="Arial" w:cs="Arial"/>
           <w:highlight w:val="yellow"/>
         </w:rPr>
-        <w:t>Proportional</w:t>
-      </w:r>
-      <w:proofErr w:type="spellEnd"/>
-      <w:r>
-        <w:rPr>
-          <w:rStyle w:val="nfase"/>
-          <w:rFonts w:ascii="Arial" w:hAnsi="Arial" w:cs="Arial"/>
-          <w:highlight w:val="yellow"/>
-        </w:rPr>
-        <w:t xml:space="preserve"> design systems </w:t>
-      </w:r>
-      <w:proofErr w:type="spellStart"/>
-      <w:r>
-        <w:rPr>
-          <w:rStyle w:val="nfase"/>
-          <w:rFonts w:ascii="Arial" w:hAnsi="Arial" w:cs="Arial"/>
-          <w:highlight w:val="yellow"/>
-        </w:rPr>
-        <w:t>with</w:t>
-      </w:r>
-      <w:proofErr w:type="spellEnd"/>
-      <w:r>
-        <w:rPr>
-          <w:rStyle w:val="nfase"/>
-          <w:rFonts w:ascii="Arial" w:hAnsi="Arial" w:cs="Arial"/>
-          <w:highlight w:val="yellow"/>
-        </w:rPr>
-        <w:t xml:space="preserve"> </w:t>
-      </w:r>
-      <w:proofErr w:type="spellStart"/>
-      <w:r>
-        <w:rPr>
-          <w:rStyle w:val="nfase"/>
-          <w:rFonts w:ascii="Arial" w:hAnsi="Arial" w:cs="Arial"/>
-          <w:highlight w:val="yellow"/>
-        </w:rPr>
-        <w:t>Proportio</w:t>
-      </w:r>
-      <w:proofErr w:type="spellEnd"/>
-      <w:r>
-        <w:rPr>
-          <w:rStyle w:val="nfase"/>
-          <w:rFonts w:ascii="Arial" w:hAnsi="Arial" w:cs="Arial"/>
-          <w:highlight w:val="yellow"/>
-        </w:rPr>
-        <w:t xml:space="preserve"> App</w:t>
-      </w:r>
-      <w:r>
-        <w:rPr>
-          <w:rFonts w:ascii="Arial" w:hAnsi="Arial" w:cs="Arial"/>
-          <w:highlight w:val="yellow"/>
-        </w:rPr>
-        <w:t xml:space="preserve">. </w:t>
-      </w:r>
-      <w:proofErr w:type="spellStart"/>
-      <w:r>
-        <w:rPr>
-          <w:rFonts w:ascii="Arial" w:hAnsi="Arial" w:cs="Arial"/>
-          <w:highlight w:val="yellow"/>
-        </w:rPr>
-        <w:t>Medium</w:t>
-      </w:r>
-      <w:proofErr w:type="spellEnd"/>
-      <w:r>
-        <w:rPr>
-          <w:rFonts w:ascii="Arial" w:hAnsi="Arial" w:cs="Arial"/>
-          <w:highlight w:val="yellow"/>
-        </w:rPr>
-        <w:t xml:space="preserve">, 2023. Disponível em: </w:t>
+        <w:t>Proportional design systems with Proportio App</w:t>
+      </w:r>
+      <w:r>
+        <w:rPr>
+          <w:rFonts w:ascii="Arial" w:hAnsi="Arial" w:cs="Arial"/>
+          <w:highlight w:val="yellow"/>
+        </w:rPr>
+        <w:t xml:space="preserve">. Medium, 2023. Disponível em: </w:t>
       </w:r>
       <w:hyperlink r:id="rId42" w:tgtFrame="_new" w:history="1">
         <w:r>
@@ -16840,40 +16075,14 @@
           <w:rFonts w:ascii="Arial" w:hAnsi="Arial" w:cs="Arial"/>
           <w:highlight w:val="yellow"/>
         </w:rPr>
-        <w:t xml:space="preserve">Mobile menu UI </w:t>
-      </w:r>
-      <w:proofErr w:type="spellStart"/>
-      <w:r>
-        <w:rPr>
-          <w:rStyle w:val="nfase"/>
-          <w:rFonts w:ascii="Arial" w:hAnsi="Arial" w:cs="Arial"/>
-          <w:highlight w:val="yellow"/>
-        </w:rPr>
-        <w:t>inspiration</w:t>
-      </w:r>
-      <w:proofErr w:type="spellEnd"/>
-      <w:r>
-        <w:rPr>
-          <w:rFonts w:ascii="Arial" w:hAnsi="Arial" w:cs="Arial"/>
-          <w:highlight w:val="yellow"/>
-        </w:rPr>
-        <w:t xml:space="preserve">. </w:t>
-      </w:r>
-      <w:proofErr w:type="spellStart"/>
-      <w:r>
-        <w:rPr>
-          <w:rFonts w:ascii="Arial" w:hAnsi="Arial" w:cs="Arial"/>
-          <w:highlight w:val="yellow"/>
-        </w:rPr>
-        <w:t>Medium</w:t>
-      </w:r>
-      <w:proofErr w:type="spellEnd"/>
-      <w:r>
-        <w:rPr>
-          <w:rFonts w:ascii="Arial" w:hAnsi="Arial" w:cs="Arial"/>
-          <w:highlight w:val="yellow"/>
-        </w:rPr>
-        <w:t xml:space="preserve">, 2022. Disponível em: </w:t>
+        <w:t>Mobile menu UI inspiration</w:t>
+      </w:r>
+      <w:r>
+        <w:rPr>
+          <w:rFonts w:ascii="Arial" w:hAnsi="Arial" w:cs="Arial"/>
+          <w:highlight w:val="yellow"/>
+        </w:rPr>
+        <w:t xml:space="preserve">. Medium, 2022. Disponível em: </w:t>
       </w:r>
       <w:hyperlink r:id="rId43" w:tgtFrame="_new" w:history="1">
         <w:r>
@@ -16914,40 +16123,14 @@
           <w:rFonts w:ascii="Arial" w:hAnsi="Arial" w:cs="Arial"/>
           <w:highlight w:val="yellow"/>
         </w:rPr>
-        <w:t xml:space="preserve">Persona – </w:t>
-      </w:r>
-      <w:proofErr w:type="spellStart"/>
-      <w:r>
-        <w:rPr>
-          <w:rStyle w:val="nfase"/>
-          <w:rFonts w:ascii="Arial" w:hAnsi="Arial" w:cs="Arial"/>
-          <w:highlight w:val="yellow"/>
-        </w:rPr>
-        <w:t>Template</w:t>
-      </w:r>
-      <w:proofErr w:type="spellEnd"/>
-      <w:r>
-        <w:rPr>
-          <w:rFonts w:ascii="Arial" w:hAnsi="Arial" w:cs="Arial"/>
-          <w:highlight w:val="yellow"/>
-        </w:rPr>
-        <w:t xml:space="preserve">. </w:t>
-      </w:r>
-      <w:proofErr w:type="spellStart"/>
-      <w:r>
-        <w:rPr>
-          <w:rFonts w:ascii="Arial" w:hAnsi="Arial" w:cs="Arial"/>
-          <w:highlight w:val="yellow"/>
-        </w:rPr>
-        <w:t>Figma</w:t>
-      </w:r>
-      <w:proofErr w:type="spellEnd"/>
-      <w:r>
-        <w:rPr>
-          <w:rFonts w:ascii="Arial" w:hAnsi="Arial" w:cs="Arial"/>
-          <w:highlight w:val="yellow"/>
-        </w:rPr>
-        <w:t xml:space="preserve">, [s.d.]. Disponível em: </w:t>
+        <w:t>Persona – Template</w:t>
+      </w:r>
+      <w:r>
+        <w:rPr>
+          <w:rFonts w:ascii="Arial" w:hAnsi="Arial" w:cs="Arial"/>
+          <w:highlight w:val="yellow"/>
+        </w:rPr>
+        <w:t xml:space="preserve">. Figma, [s.d.]. Disponível em: </w:t>
       </w:r>
       <w:hyperlink r:id="rId44" w:tgtFrame="_new" w:history="1">
         <w:r>
@@ -16995,23 +16178,7 @@
           <w:rFonts w:ascii="Arial" w:hAnsi="Arial" w:cs="Arial"/>
           <w:highlight w:val="yellow"/>
         </w:rPr>
-        <w:t xml:space="preserve">. </w:t>
-      </w:r>
-      <w:proofErr w:type="spellStart"/>
-      <w:r>
-        <w:rPr>
-          <w:rFonts w:ascii="Arial" w:hAnsi="Arial" w:cs="Arial"/>
-          <w:highlight w:val="yellow"/>
-        </w:rPr>
-        <w:t>Programmers</w:t>
-      </w:r>
-      <w:proofErr w:type="spellEnd"/>
-      <w:r>
-        <w:rPr>
-          <w:rFonts w:ascii="Arial" w:hAnsi="Arial" w:cs="Arial"/>
-          <w:highlight w:val="yellow"/>
-        </w:rPr>
-        <w:t xml:space="preserve">, 2022. Disponível em: </w:t>
+        <w:t xml:space="preserve">. Programmers, 2022. Disponível em: </w:t>
       </w:r>
       <w:hyperlink r:id="rId45" w:tgtFrame="_new" w:history="1">
         <w:r>
@@ -17058,39 +16225,7 @@
           <w:rFonts w:ascii="Arial" w:hAnsi="Arial" w:cs="Arial"/>
           <w:highlight w:val="yellow"/>
         </w:rPr>
-        <w:t xml:space="preserve">. </w:t>
-      </w:r>
-      <w:proofErr w:type="spellStart"/>
-      <w:r>
-        <w:rPr>
-          <w:rFonts w:ascii="Arial" w:hAnsi="Arial" w:cs="Arial"/>
-          <w:highlight w:val="yellow"/>
-        </w:rPr>
-        <w:t>Aela</w:t>
-      </w:r>
-      <w:proofErr w:type="spellEnd"/>
-      <w:r>
-        <w:rPr>
-          <w:rFonts w:ascii="Arial" w:hAnsi="Arial" w:cs="Arial"/>
-          <w:highlight w:val="yellow"/>
-        </w:rPr>
-        <w:t xml:space="preserve"> </w:t>
-      </w:r>
-      <w:proofErr w:type="spellStart"/>
-      <w:r>
-        <w:rPr>
-          <w:rFonts w:ascii="Arial" w:hAnsi="Arial" w:cs="Arial"/>
-          <w:highlight w:val="yellow"/>
-        </w:rPr>
-        <w:t>School</w:t>
-      </w:r>
-      <w:proofErr w:type="spellEnd"/>
-      <w:r>
-        <w:rPr>
-          <w:rFonts w:ascii="Arial" w:hAnsi="Arial" w:cs="Arial"/>
-          <w:highlight w:val="yellow"/>
-        </w:rPr>
-        <w:t xml:space="preserve">, [s.d.]. Disponível em: </w:t>
+        <w:t xml:space="preserve">. Aela School, [s.d.]. Disponível em: </w:t>
       </w:r>
       <w:hyperlink r:id="rId46" w:tgtFrame="_new" w:history="1">
         <w:r>
@@ -17142,7 +16277,7 @@
 </file>
 
 <file path=word/endnotes.xml><?xml version="1.0" encoding="utf-8"?>
-<w:endnotes xmlns:wpc="http://schemas.microsoft.com/office/word/2010/wordprocessingCanvas" xmlns:cx="http://schemas.microsoft.com/office/drawing/2014/chartex" xmlns:cx1="http://schemas.microsoft.com/office/drawing/2015/9/8/chartex" xmlns:cx2="http://schemas.microsoft.com/office/drawing/2015/10/21/chartex" xmlns:cx3="http://schemas.microsoft.com/office/drawing/2016/5/9/chartex" xmlns:cx4="http://schemas.microsoft.com/office/drawing/2016/5/10/chartex" xmlns:cx5="http://schemas.microsoft.com/office/drawing/2016/5/11/chartex" xmlns:cx6="http://schemas.microsoft.com/office/drawing/2016/5/12/chartex" xmlns:cx7="http://schemas.microsoft.com/office/drawing/2016/5/13/chartex" xmlns:cx8="http://schemas.microsoft.com/office/drawing/2016/5/14/chartex" xmlns:mc="http://schemas.openxmlformats.org/markup-compatibility/2006" xmlns:aink="http://schemas.microsoft.com/office/drawing/2016/ink" xmlns:am3d="http://schemas.microsoft.com/office/drawing/2017/model3d" xmlns:o="urn:schemas-microsoft-com:office:office" xmlns:r="http://schemas.openxmlformats.org/officeDocument/2006/relationships" xmlns:m="http://schemas.openxmlformats.org/officeDocument/2006/math" xmlns:v="urn:schemas-microsoft-com:vml" xmlns:wp14="http://schemas.microsoft.com/office/word/2010/wordprocessingDrawing" xmlns:wp="http://schemas.openxmlformats.org/drawingml/2006/wordprocessingDrawing" xmlns:w10="urn:schemas-microsoft-com:office:word" xmlns:w="http://schemas.openxmlformats.org/wordprocessingml/2006/main" xmlns:w14="http://schemas.microsoft.com/office/word/2010/wordml" xmlns:w15="http://schemas.microsoft.com/office/word/2012/wordml" xmlns:w16cex="http://schemas.microsoft.com/office/word/2018/wordml/cex" xmlns:w16cid="http://schemas.microsoft.com/office/word/2016/wordml/cid" xmlns:w16="http://schemas.microsoft.com/office/word/2018/wordml" xmlns:w16se="http://schemas.microsoft.com/office/word/2015/wordml/symex" xmlns:wpg="http://schemas.microsoft.com/office/word/2010/wordprocessingGroup" xmlns:wpi="http://schemas.microsoft.com/office/word/2010/wordprocessingInk" xmlns:wne="http://schemas.microsoft.com/office/word/2006/wordml" xmlns:wps="http://schemas.microsoft.com/office/word/2010/wordprocessingShape" mc:Ignorable="w14 w15 w16se w16cid w16 w16cex wp14">
+<w:endnotes xmlns:wpc="http://schemas.microsoft.com/office/word/2010/wordprocessingCanvas" xmlns:cx="http://schemas.microsoft.com/office/drawing/2014/chartex" xmlns:cx1="http://schemas.microsoft.com/office/drawing/2015/9/8/chartex" xmlns:cx2="http://schemas.microsoft.com/office/drawing/2015/10/21/chartex" xmlns:cx3="http://schemas.microsoft.com/office/drawing/2016/5/9/chartex" xmlns:cx4="http://schemas.microsoft.com/office/drawing/2016/5/10/chartex" xmlns:cx5="http://schemas.microsoft.com/office/drawing/2016/5/11/chartex" xmlns:cx6="http://schemas.microsoft.com/office/drawing/2016/5/12/chartex" xmlns:cx7="http://schemas.microsoft.com/office/drawing/2016/5/13/chartex" xmlns:cx8="http://schemas.microsoft.com/office/drawing/2016/5/14/chartex" xmlns:mc="http://schemas.openxmlformats.org/markup-compatibility/2006" xmlns:aink="http://schemas.microsoft.com/office/drawing/2016/ink" xmlns:am3d="http://schemas.microsoft.com/office/drawing/2017/model3d" xmlns:o="urn:schemas-microsoft-com:office:office" xmlns:oel="http://schemas.microsoft.com/office/2019/extlst" xmlns:r="http://schemas.openxmlformats.org/officeDocument/2006/relationships" xmlns:m="http://schemas.openxmlformats.org/officeDocument/2006/math" xmlns:v="urn:schemas-microsoft-com:vml" xmlns:wp14="http://schemas.microsoft.com/office/word/2010/wordprocessingDrawing" xmlns:wp="http://schemas.openxmlformats.org/drawingml/2006/wordprocessingDrawing" xmlns:w10="urn:schemas-microsoft-com:office:word" xmlns:w="http://schemas.openxmlformats.org/wordprocessingml/2006/main" xmlns:w14="http://schemas.microsoft.com/office/word/2010/wordml" xmlns:w15="http://schemas.microsoft.com/office/word/2012/wordml" xmlns:w16cex="http://schemas.microsoft.com/office/word/2018/wordml/cex" xmlns:w16cid="http://schemas.microsoft.com/office/word/2016/wordml/cid" xmlns:w16="http://schemas.microsoft.com/office/word/2018/wordml" xmlns:w16du="http://schemas.microsoft.com/office/word/2023/wordml/word16du" xmlns:w16sdtdh="http://schemas.microsoft.com/office/word/2020/wordml/sdtdatahash" xmlns:w16sdtfl="http://schemas.microsoft.com/office/word/2024/wordml/sdtformatlock" xmlns:w16se="http://schemas.microsoft.com/office/word/2015/wordml/symex" xmlns:wpg="http://schemas.microsoft.com/office/word/2010/wordprocessingGroup" xmlns:wpi="http://schemas.microsoft.com/office/word/2010/wordprocessingInk" xmlns:wne="http://schemas.microsoft.com/office/word/2006/wordml" xmlns:wps="http://schemas.microsoft.com/office/word/2010/wordprocessingShape" mc:Ignorable="w14 w15 w16se w16cid w16 w16cex w16sdtdh w16sdtfl w16du wp14">
   <w:endnote w:type="separator" w:id="-1">
     <w:p>
       <w:r>
@@ -17161,7 +16296,7 @@
 </file>
 
 <file path=word/footer1.xml><?xml version="1.0" encoding="utf-8"?>
-<w:ftr xmlns:wpc="http://schemas.microsoft.com/office/word/2010/wordprocessingCanvas" xmlns:cx="http://schemas.microsoft.com/office/drawing/2014/chartex" xmlns:cx1="http://schemas.microsoft.com/office/drawing/2015/9/8/chartex" xmlns:cx2="http://schemas.microsoft.com/office/drawing/2015/10/21/chartex" xmlns:cx3="http://schemas.microsoft.com/office/drawing/2016/5/9/chartex" xmlns:cx4="http://schemas.microsoft.com/office/drawing/2016/5/10/chartex" xmlns:cx5="http://schemas.microsoft.com/office/drawing/2016/5/11/chartex" xmlns:cx6="http://schemas.microsoft.com/office/drawing/2016/5/12/chartex" xmlns:cx7="http://schemas.microsoft.com/office/drawing/2016/5/13/chartex" xmlns:cx8="http://schemas.microsoft.com/office/drawing/2016/5/14/chartex" xmlns:mc="http://schemas.openxmlformats.org/markup-compatibility/2006" xmlns:aink="http://schemas.microsoft.com/office/drawing/2016/ink" xmlns:am3d="http://schemas.microsoft.com/office/drawing/2017/model3d" xmlns:o="urn:schemas-microsoft-com:office:office" xmlns:r="http://schemas.openxmlformats.org/officeDocument/2006/relationships" xmlns:m="http://schemas.openxmlformats.org/officeDocument/2006/math" xmlns:v="urn:schemas-microsoft-com:vml" xmlns:wp14="http://schemas.microsoft.com/office/word/2010/wordprocessingDrawing" xmlns:wp="http://schemas.openxmlformats.org/drawingml/2006/wordprocessingDrawing" xmlns:w10="urn:schemas-microsoft-com:office:word" xmlns:w="http://schemas.openxmlformats.org/wordprocessingml/2006/main" xmlns:w14="http://schemas.microsoft.com/office/word/2010/wordml" xmlns:w15="http://schemas.microsoft.com/office/word/2012/wordml" xmlns:w16cex="http://schemas.microsoft.com/office/word/2018/wordml/cex" xmlns:w16cid="http://schemas.microsoft.com/office/word/2016/wordml/cid" xmlns:w16="http://schemas.microsoft.com/office/word/2018/wordml" xmlns:w16se="http://schemas.microsoft.com/office/word/2015/wordml/symex" xmlns:wpg="http://schemas.microsoft.com/office/word/2010/wordprocessingGroup" xmlns:wpi="http://schemas.microsoft.com/office/word/2010/wordprocessingInk" xmlns:wne="http://schemas.microsoft.com/office/word/2006/wordml" xmlns:wps="http://schemas.microsoft.com/office/word/2010/wordprocessingShape" mc:Ignorable="w14 w15 w16se w16cid w16 w16cex wp14">
+<w:ftr xmlns:wpc="http://schemas.microsoft.com/office/word/2010/wordprocessingCanvas" xmlns:cx="http://schemas.microsoft.com/office/drawing/2014/chartex" xmlns:cx1="http://schemas.microsoft.com/office/drawing/2015/9/8/chartex" xmlns:cx2="http://schemas.microsoft.com/office/drawing/2015/10/21/chartex" xmlns:cx3="http://schemas.microsoft.com/office/drawing/2016/5/9/chartex" xmlns:cx4="http://schemas.microsoft.com/office/drawing/2016/5/10/chartex" xmlns:cx5="http://schemas.microsoft.com/office/drawing/2016/5/11/chartex" xmlns:cx6="http://schemas.microsoft.com/office/drawing/2016/5/12/chartex" xmlns:cx7="http://schemas.microsoft.com/office/drawing/2016/5/13/chartex" xmlns:cx8="http://schemas.microsoft.com/office/drawing/2016/5/14/chartex" xmlns:mc="http://schemas.openxmlformats.org/markup-compatibility/2006" xmlns:aink="http://schemas.microsoft.com/office/drawing/2016/ink" xmlns:am3d="http://schemas.microsoft.com/office/drawing/2017/model3d" xmlns:o="urn:schemas-microsoft-com:office:office" xmlns:oel="http://schemas.microsoft.com/office/2019/extlst" xmlns:r="http://schemas.openxmlformats.org/officeDocument/2006/relationships" xmlns:m="http://schemas.openxmlformats.org/officeDocument/2006/math" xmlns:v="urn:schemas-microsoft-com:vml" xmlns:wp14="http://schemas.microsoft.com/office/word/2010/wordprocessingDrawing" xmlns:wp="http://schemas.openxmlformats.org/drawingml/2006/wordprocessingDrawing" xmlns:w10="urn:schemas-microsoft-com:office:word" xmlns:w="http://schemas.openxmlformats.org/wordprocessingml/2006/main" xmlns:w14="http://schemas.microsoft.com/office/word/2010/wordml" xmlns:w15="http://schemas.microsoft.com/office/word/2012/wordml" xmlns:w16cex="http://schemas.microsoft.com/office/word/2018/wordml/cex" xmlns:w16cid="http://schemas.microsoft.com/office/word/2016/wordml/cid" xmlns:w16="http://schemas.microsoft.com/office/word/2018/wordml" xmlns:w16du="http://schemas.microsoft.com/office/word/2023/wordml/word16du" xmlns:w16sdtdh="http://schemas.microsoft.com/office/word/2020/wordml/sdtdatahash" xmlns:w16sdtfl="http://schemas.microsoft.com/office/word/2024/wordml/sdtformatlock" xmlns:w16se="http://schemas.microsoft.com/office/word/2015/wordml/symex" xmlns:wpg="http://schemas.microsoft.com/office/word/2010/wordprocessingGroup" xmlns:wpi="http://schemas.microsoft.com/office/word/2010/wordprocessingInk" xmlns:wne="http://schemas.microsoft.com/office/word/2006/wordml" xmlns:wps="http://schemas.microsoft.com/office/word/2010/wordprocessingShape" mc:Ignorable="w14 w15 w16se w16cid w16 w16cex w16sdtdh w16sdtfl w16du wp14">
   <w:tbl>
     <w:tblPr>
       <w:tblW w:w="0" w:type="auto"/>
@@ -17222,7 +16357,7 @@
 </file>
 
 <file path=word/footer2.xml><?xml version="1.0" encoding="utf-8"?>
-<w:ftr xmlns:wpc="http://schemas.microsoft.com/office/word/2010/wordprocessingCanvas" xmlns:cx="http://schemas.microsoft.com/office/drawing/2014/chartex" xmlns:cx1="http://schemas.microsoft.com/office/drawing/2015/9/8/chartex" xmlns:cx2="http://schemas.microsoft.com/office/drawing/2015/10/21/chartex" xmlns:cx3="http://schemas.microsoft.com/office/drawing/2016/5/9/chartex" xmlns:cx4="http://schemas.microsoft.com/office/drawing/2016/5/10/chartex" xmlns:cx5="http://schemas.microsoft.com/office/drawing/2016/5/11/chartex" xmlns:cx6="http://schemas.microsoft.com/office/drawing/2016/5/12/chartex" xmlns:cx7="http://schemas.microsoft.com/office/drawing/2016/5/13/chartex" xmlns:cx8="http://schemas.microsoft.com/office/drawing/2016/5/14/chartex" xmlns:mc="http://schemas.openxmlformats.org/markup-compatibility/2006" xmlns:aink="http://schemas.microsoft.com/office/drawing/2016/ink" xmlns:am3d="http://schemas.microsoft.com/office/drawing/2017/model3d" xmlns:o="urn:schemas-microsoft-com:office:office" xmlns:r="http://schemas.openxmlformats.org/officeDocument/2006/relationships" xmlns:m="http://schemas.openxmlformats.org/officeDocument/2006/math" xmlns:v="urn:schemas-microsoft-com:vml" xmlns:wp14="http://schemas.microsoft.com/office/word/2010/wordprocessingDrawing" xmlns:wp="http://schemas.openxmlformats.org/drawingml/2006/wordprocessingDrawing" xmlns:w10="urn:schemas-microsoft-com:office:word" xmlns:w="http://schemas.openxmlformats.org/wordprocessingml/2006/main" xmlns:w14="http://schemas.microsoft.com/office/word/2010/wordml" xmlns:w15="http://schemas.microsoft.com/office/word/2012/wordml" xmlns:w16cex="http://schemas.microsoft.com/office/word/2018/wordml/cex" xmlns:w16cid="http://schemas.microsoft.com/office/word/2016/wordml/cid" xmlns:w16="http://schemas.microsoft.com/office/word/2018/wordml" xmlns:w16se="http://schemas.microsoft.com/office/word/2015/wordml/symex" xmlns:wpg="http://schemas.microsoft.com/office/word/2010/wordprocessingGroup" xmlns:wpi="http://schemas.microsoft.com/office/word/2010/wordprocessingInk" xmlns:wne="http://schemas.microsoft.com/office/word/2006/wordml" xmlns:wps="http://schemas.microsoft.com/office/word/2010/wordprocessingShape" mc:Ignorable="w14 w15 w16se w16cid w16 w16cex wp14">
+<w:ftr xmlns:wpc="http://schemas.microsoft.com/office/word/2010/wordprocessingCanvas" xmlns:cx="http://schemas.microsoft.com/office/drawing/2014/chartex" xmlns:cx1="http://schemas.microsoft.com/office/drawing/2015/9/8/chartex" xmlns:cx2="http://schemas.microsoft.com/office/drawing/2015/10/21/chartex" xmlns:cx3="http://schemas.microsoft.com/office/drawing/2016/5/9/chartex" xmlns:cx4="http://schemas.microsoft.com/office/drawing/2016/5/10/chartex" xmlns:cx5="http://schemas.microsoft.com/office/drawing/2016/5/11/chartex" xmlns:cx6="http://schemas.microsoft.com/office/drawing/2016/5/12/chartex" xmlns:cx7="http://schemas.microsoft.com/office/drawing/2016/5/13/chartex" xmlns:cx8="http://schemas.microsoft.com/office/drawing/2016/5/14/chartex" xmlns:mc="http://schemas.openxmlformats.org/markup-compatibility/2006" xmlns:aink="http://schemas.microsoft.com/office/drawing/2016/ink" xmlns:am3d="http://schemas.microsoft.com/office/drawing/2017/model3d" xmlns:o="urn:schemas-microsoft-com:office:office" xmlns:oel="http://schemas.microsoft.com/office/2019/extlst" xmlns:r="http://schemas.openxmlformats.org/officeDocument/2006/relationships" xmlns:m="http://schemas.openxmlformats.org/officeDocument/2006/math" xmlns:v="urn:schemas-microsoft-com:vml" xmlns:wp14="http://schemas.microsoft.com/office/word/2010/wordprocessingDrawing" xmlns:wp="http://schemas.openxmlformats.org/drawingml/2006/wordprocessingDrawing" xmlns:w10="urn:schemas-microsoft-com:office:word" xmlns:w="http://schemas.openxmlformats.org/wordprocessingml/2006/main" xmlns:w14="http://schemas.microsoft.com/office/word/2010/wordml" xmlns:w15="http://schemas.microsoft.com/office/word/2012/wordml" xmlns:w16cex="http://schemas.microsoft.com/office/word/2018/wordml/cex" xmlns:w16cid="http://schemas.microsoft.com/office/word/2016/wordml/cid" xmlns:w16="http://schemas.microsoft.com/office/word/2018/wordml" xmlns:w16du="http://schemas.microsoft.com/office/word/2023/wordml/word16du" xmlns:w16sdtdh="http://schemas.microsoft.com/office/word/2020/wordml/sdtdatahash" xmlns:w16sdtfl="http://schemas.microsoft.com/office/word/2024/wordml/sdtformatlock" xmlns:w16se="http://schemas.microsoft.com/office/word/2015/wordml/symex" xmlns:wpg="http://schemas.microsoft.com/office/word/2010/wordprocessingGroup" xmlns:wpi="http://schemas.microsoft.com/office/word/2010/wordprocessingInk" xmlns:wne="http://schemas.microsoft.com/office/word/2006/wordml" xmlns:wps="http://schemas.microsoft.com/office/word/2010/wordprocessingShape" mc:Ignorable="w14 w15 w16se w16cid w16 w16cex w16sdtdh w16sdtfl w16du wp14">
   <w:p>
     <w:pPr>
       <w:pStyle w:val="Rodap"/>
@@ -17232,7 +16367,7 @@
 </file>
 
 <file path=word/footnotes.xml><?xml version="1.0" encoding="utf-8"?>
-<w:footnotes xmlns:wpc="http://schemas.microsoft.com/office/word/2010/wordprocessingCanvas" xmlns:cx="http://schemas.microsoft.com/office/drawing/2014/chartex" xmlns:cx1="http://schemas.microsoft.com/office/drawing/2015/9/8/chartex" xmlns:cx2="http://schemas.microsoft.com/office/drawing/2015/10/21/chartex" xmlns:cx3="http://schemas.microsoft.com/office/drawing/2016/5/9/chartex" xmlns:cx4="http://schemas.microsoft.com/office/drawing/2016/5/10/chartex" xmlns:cx5="http://schemas.microsoft.com/office/drawing/2016/5/11/chartex" xmlns:cx6="http://schemas.microsoft.com/office/drawing/2016/5/12/chartex" xmlns:cx7="http://schemas.microsoft.com/office/drawing/2016/5/13/chartex" xmlns:cx8="http://schemas.microsoft.com/office/drawing/2016/5/14/chartex" xmlns:mc="http://schemas.openxmlformats.org/markup-compatibility/2006" xmlns:aink="http://schemas.microsoft.com/office/drawing/2016/ink" xmlns:am3d="http://schemas.microsoft.com/office/drawing/2017/model3d" xmlns:o="urn:schemas-microsoft-com:office:office" xmlns:r="http://schemas.openxmlformats.org/officeDocument/2006/relationships" xmlns:m="http://schemas.openxmlformats.org/officeDocument/2006/math" xmlns:v="urn:schemas-microsoft-com:vml" xmlns:wp14="http://schemas.microsoft.com/office/word/2010/wordprocessingDrawing" xmlns:wp="http://schemas.openxmlformats.org/drawingml/2006/wordprocessingDrawing" xmlns:w10="urn:schemas-microsoft-com:office:word" xmlns:w="http://schemas.openxmlformats.org/wordprocessingml/2006/main" xmlns:w14="http://schemas.microsoft.com/office/word/2010/wordml" xmlns:w15="http://schemas.microsoft.com/office/word/2012/wordml" xmlns:w16cex="http://schemas.microsoft.com/office/word/2018/wordml/cex" xmlns:w16cid="http://schemas.microsoft.com/office/word/2016/wordml/cid" xmlns:w16="http://schemas.microsoft.com/office/word/2018/wordml" xmlns:w16se="http://schemas.microsoft.com/office/word/2015/wordml/symex" xmlns:wpg="http://schemas.microsoft.com/office/word/2010/wordprocessingGroup" xmlns:wpi="http://schemas.microsoft.com/office/word/2010/wordprocessingInk" xmlns:wne="http://schemas.microsoft.com/office/word/2006/wordml" xmlns:wps="http://schemas.microsoft.com/office/word/2010/wordprocessingShape" mc:Ignorable="w14 w15 w16se w16cid w16 w16cex wp14">
+<w:footnotes xmlns:wpc="http://schemas.microsoft.com/office/word/2010/wordprocessingCanvas" xmlns:cx="http://schemas.microsoft.com/office/drawing/2014/chartex" xmlns:cx1="http://schemas.microsoft.com/office/drawing/2015/9/8/chartex" xmlns:cx2="http://schemas.microsoft.com/office/drawing/2015/10/21/chartex" xmlns:cx3="http://schemas.microsoft.com/office/drawing/2016/5/9/chartex" xmlns:cx4="http://schemas.microsoft.com/office/drawing/2016/5/10/chartex" xmlns:cx5="http://schemas.microsoft.com/office/drawing/2016/5/11/chartex" xmlns:cx6="http://schemas.microsoft.com/office/drawing/2016/5/12/chartex" xmlns:cx7="http://schemas.microsoft.com/office/drawing/2016/5/13/chartex" xmlns:cx8="http://schemas.microsoft.com/office/drawing/2016/5/14/chartex" xmlns:mc="http://schemas.openxmlformats.org/markup-compatibility/2006" xmlns:aink="http://schemas.microsoft.com/office/drawing/2016/ink" xmlns:am3d="http://schemas.microsoft.com/office/drawing/2017/model3d" xmlns:o="urn:schemas-microsoft-com:office:office" xmlns:oel="http://schemas.microsoft.com/office/2019/extlst" xmlns:r="http://schemas.openxmlformats.org/officeDocument/2006/relationships" xmlns:m="http://schemas.openxmlformats.org/officeDocument/2006/math" xmlns:v="urn:schemas-microsoft-com:vml" xmlns:wp14="http://schemas.microsoft.com/office/word/2010/wordprocessingDrawing" xmlns:wp="http://schemas.openxmlformats.org/drawingml/2006/wordprocessingDrawing" xmlns:w10="urn:schemas-microsoft-com:office:word" xmlns:w="http://schemas.openxmlformats.org/wordprocessingml/2006/main" xmlns:w14="http://schemas.microsoft.com/office/word/2010/wordml" xmlns:w15="http://schemas.microsoft.com/office/word/2012/wordml" xmlns:w16cex="http://schemas.microsoft.com/office/word/2018/wordml/cex" xmlns:w16cid="http://schemas.microsoft.com/office/word/2016/wordml/cid" xmlns:w16="http://schemas.microsoft.com/office/word/2018/wordml" xmlns:w16du="http://schemas.microsoft.com/office/word/2023/wordml/word16du" xmlns:w16sdtdh="http://schemas.microsoft.com/office/word/2020/wordml/sdtdatahash" xmlns:w16sdtfl="http://schemas.microsoft.com/office/word/2024/wordml/sdtformatlock" xmlns:w16se="http://schemas.microsoft.com/office/word/2015/wordml/symex" xmlns:wpg="http://schemas.microsoft.com/office/word/2010/wordprocessingGroup" xmlns:wpi="http://schemas.microsoft.com/office/word/2010/wordprocessingInk" xmlns:wne="http://schemas.microsoft.com/office/word/2006/wordml" xmlns:wps="http://schemas.microsoft.com/office/word/2010/wordprocessingShape" mc:Ignorable="w14 w15 w16se w16cid w16 w16cex w16sdtdh w16sdtfl w16du wp14">
   <w:footnote w:type="separator" w:id="-1">
     <w:p>
       <w:r>
@@ -17251,7 +16386,7 @@
 </file>
 
 <file path=word/header1.xml><?xml version="1.0" encoding="utf-8"?>
-<w:hdr xmlns:wpc="http://schemas.microsoft.com/office/word/2010/wordprocessingCanvas" xmlns:cx="http://schemas.microsoft.com/office/drawing/2014/chartex" xmlns:cx1="http://schemas.microsoft.com/office/drawing/2015/9/8/chartex" xmlns:cx2="http://schemas.microsoft.com/office/drawing/2015/10/21/chartex" xmlns:cx3="http://schemas.microsoft.com/office/drawing/2016/5/9/chartex" xmlns:cx4="http://schemas.microsoft.com/office/drawing/2016/5/10/chartex" xmlns:cx5="http://schemas.microsoft.com/office/drawing/2016/5/11/chartex" xmlns:cx6="http://schemas.microsoft.com/office/drawing/2016/5/12/chartex" xmlns:cx7="http://schemas.microsoft.com/office/drawing/2016/5/13/chartex" xmlns:cx8="http://schemas.microsoft.com/office/drawing/2016/5/14/chartex" xmlns:mc="http://schemas.openxmlformats.org/markup-compatibility/2006" xmlns:aink="http://schemas.microsoft.com/office/drawing/2016/ink" xmlns:am3d="http://schemas.microsoft.com/office/drawing/2017/model3d" xmlns:o="urn:schemas-microsoft-com:office:office" xmlns:r="http://schemas.openxmlformats.org/officeDocument/2006/relationships" xmlns:m="http://schemas.openxmlformats.org/officeDocument/2006/math" xmlns:v="urn:schemas-microsoft-com:vml" xmlns:wp14="http://schemas.microsoft.com/office/word/2010/wordprocessingDrawing" xmlns:wp="http://schemas.openxmlformats.org/drawingml/2006/wordprocessingDrawing" xmlns:w10="urn:schemas-microsoft-com:office:word" xmlns:w="http://schemas.openxmlformats.org/wordprocessingml/2006/main" xmlns:w14="http://schemas.microsoft.com/office/word/2010/wordml" xmlns:w15="http://schemas.microsoft.com/office/word/2012/wordml" xmlns:w16cex="http://schemas.microsoft.com/office/word/2018/wordml/cex" xmlns:w16cid="http://schemas.microsoft.com/office/word/2016/wordml/cid" xmlns:w16="http://schemas.microsoft.com/office/word/2018/wordml" xmlns:w16se="http://schemas.microsoft.com/office/word/2015/wordml/symex" xmlns:wpg="http://schemas.microsoft.com/office/word/2010/wordprocessingGroup" xmlns:wpi="http://schemas.microsoft.com/office/word/2010/wordprocessingInk" xmlns:wne="http://schemas.microsoft.com/office/word/2006/wordml" xmlns:wps="http://schemas.microsoft.com/office/word/2010/wordprocessingShape" mc:Ignorable="w14 w15 w16se w16cid w16 w16cex wp14">
+<w:hdr xmlns:wpc="http://schemas.microsoft.com/office/word/2010/wordprocessingCanvas" xmlns:cx="http://schemas.microsoft.com/office/drawing/2014/chartex" xmlns:cx1="http://schemas.microsoft.com/office/drawing/2015/9/8/chartex" xmlns:cx2="http://schemas.microsoft.com/office/drawing/2015/10/21/chartex" xmlns:cx3="http://schemas.microsoft.com/office/drawing/2016/5/9/chartex" xmlns:cx4="http://schemas.microsoft.com/office/drawing/2016/5/10/chartex" xmlns:cx5="http://schemas.microsoft.com/office/drawing/2016/5/11/chartex" xmlns:cx6="http://schemas.microsoft.com/office/drawing/2016/5/12/chartex" xmlns:cx7="http://schemas.microsoft.com/office/drawing/2016/5/13/chartex" xmlns:cx8="http://schemas.microsoft.com/office/drawing/2016/5/14/chartex" xmlns:mc="http://schemas.openxmlformats.org/markup-compatibility/2006" xmlns:aink="http://schemas.microsoft.com/office/drawing/2016/ink" xmlns:am3d="http://schemas.microsoft.com/office/drawing/2017/model3d" xmlns:o="urn:schemas-microsoft-com:office:office" xmlns:oel="http://schemas.microsoft.com/office/2019/extlst" xmlns:r="http://schemas.openxmlformats.org/officeDocument/2006/relationships" xmlns:m="http://schemas.openxmlformats.org/officeDocument/2006/math" xmlns:v="urn:schemas-microsoft-com:vml" xmlns:wp14="http://schemas.microsoft.com/office/word/2010/wordprocessingDrawing" xmlns:wp="http://schemas.openxmlformats.org/drawingml/2006/wordprocessingDrawing" xmlns:w10="urn:schemas-microsoft-com:office:word" xmlns:w="http://schemas.openxmlformats.org/wordprocessingml/2006/main" xmlns:w14="http://schemas.microsoft.com/office/word/2010/wordml" xmlns:w15="http://schemas.microsoft.com/office/word/2012/wordml" xmlns:w16cex="http://schemas.microsoft.com/office/word/2018/wordml/cex" xmlns:w16cid="http://schemas.microsoft.com/office/word/2016/wordml/cid" xmlns:w16="http://schemas.microsoft.com/office/word/2018/wordml" xmlns:w16du="http://schemas.microsoft.com/office/word/2023/wordml/word16du" xmlns:w16sdtdh="http://schemas.microsoft.com/office/word/2020/wordml/sdtdatahash" xmlns:w16sdtfl="http://schemas.microsoft.com/office/word/2024/wordml/sdtformatlock" xmlns:w16se="http://schemas.microsoft.com/office/word/2015/wordml/symex" xmlns:wpg="http://schemas.microsoft.com/office/word/2010/wordprocessingGroup" xmlns:wpi="http://schemas.microsoft.com/office/word/2010/wordprocessingInk" xmlns:wne="http://schemas.microsoft.com/office/word/2006/wordml" xmlns:wps="http://schemas.microsoft.com/office/word/2010/wordprocessingShape" mc:Ignorable="w14 w15 w16se w16cid w16 w16cex w16sdtdh w16sdtfl w16du wp14">
   <w:p>
     <w:pPr>
       <w:pStyle w:val="Cabealho"/>
@@ -17262,7 +16397,7 @@
 </file>
 
 <file path=word/header2.xml><?xml version="1.0" encoding="utf-8"?>
-<w:hdr xmlns:wpc="http://schemas.microsoft.com/office/word/2010/wordprocessingCanvas" xmlns:cx="http://schemas.microsoft.com/office/drawing/2014/chartex" xmlns:cx1="http://schemas.microsoft.com/office/drawing/2015/9/8/chartex" xmlns:cx2="http://schemas.microsoft.com/office/drawing/2015/10/21/chartex" xmlns:cx3="http://schemas.microsoft.com/office/drawing/2016/5/9/chartex" xmlns:cx4="http://schemas.microsoft.com/office/drawing/2016/5/10/chartex" xmlns:cx5="http://schemas.microsoft.com/office/drawing/2016/5/11/chartex" xmlns:cx6="http://schemas.microsoft.com/office/drawing/2016/5/12/chartex" xmlns:cx7="http://schemas.microsoft.com/office/drawing/2016/5/13/chartex" xmlns:cx8="http://schemas.microsoft.com/office/drawing/2016/5/14/chartex" xmlns:mc="http://schemas.openxmlformats.org/markup-compatibility/2006" xmlns:aink="http://schemas.microsoft.com/office/drawing/2016/ink" xmlns:am3d="http://schemas.microsoft.com/office/drawing/2017/model3d" xmlns:o="urn:schemas-microsoft-com:office:office" xmlns:r="http://schemas.openxmlformats.org/officeDocument/2006/relationships" xmlns:m="http://schemas.openxmlformats.org/officeDocument/2006/math" xmlns:v="urn:schemas-microsoft-com:vml" xmlns:wp14="http://schemas.microsoft.com/office/word/2010/wordprocessingDrawing" xmlns:wp="http://schemas.openxmlformats.org/drawingml/2006/wordprocessingDrawing" xmlns:w10="urn:schemas-microsoft-com:office:word" xmlns:w="http://schemas.openxmlformats.org/wordprocessingml/2006/main" xmlns:w14="http://schemas.microsoft.com/office/word/2010/wordml" xmlns:w15="http://schemas.microsoft.com/office/word/2012/wordml" xmlns:w16cex="http://schemas.microsoft.com/office/word/2018/wordml/cex" xmlns:w16cid="http://schemas.microsoft.com/office/word/2016/wordml/cid" xmlns:w16="http://schemas.microsoft.com/office/word/2018/wordml" xmlns:w16se="http://schemas.microsoft.com/office/word/2015/wordml/symex" xmlns:wpg="http://schemas.microsoft.com/office/word/2010/wordprocessingGroup" xmlns:wpi="http://schemas.microsoft.com/office/word/2010/wordprocessingInk" xmlns:wne="http://schemas.microsoft.com/office/word/2006/wordml" xmlns:wps="http://schemas.microsoft.com/office/word/2010/wordprocessingShape" mc:Ignorable="w14 w15 w16se w16cid w16 w16cex wp14">
+<w:hdr xmlns:wpc="http://schemas.microsoft.com/office/word/2010/wordprocessingCanvas" xmlns:cx="http://schemas.microsoft.com/office/drawing/2014/chartex" xmlns:cx1="http://schemas.microsoft.com/office/drawing/2015/9/8/chartex" xmlns:cx2="http://schemas.microsoft.com/office/drawing/2015/10/21/chartex" xmlns:cx3="http://schemas.microsoft.com/office/drawing/2016/5/9/chartex" xmlns:cx4="http://schemas.microsoft.com/office/drawing/2016/5/10/chartex" xmlns:cx5="http://schemas.microsoft.com/office/drawing/2016/5/11/chartex" xmlns:cx6="http://schemas.microsoft.com/office/drawing/2016/5/12/chartex" xmlns:cx7="http://schemas.microsoft.com/office/drawing/2016/5/13/chartex" xmlns:cx8="http://schemas.microsoft.com/office/drawing/2016/5/14/chartex" xmlns:mc="http://schemas.openxmlformats.org/markup-compatibility/2006" xmlns:aink="http://schemas.microsoft.com/office/drawing/2016/ink" xmlns:am3d="http://schemas.microsoft.com/office/drawing/2017/model3d" xmlns:o="urn:schemas-microsoft-com:office:office" xmlns:oel="http://schemas.microsoft.com/office/2019/extlst" xmlns:r="http://schemas.openxmlformats.org/officeDocument/2006/relationships" xmlns:m="http://schemas.openxmlformats.org/officeDocument/2006/math" xmlns:v="urn:schemas-microsoft-com:vml" xmlns:wp14="http://schemas.microsoft.com/office/word/2010/wordprocessingDrawing" xmlns:wp="http://schemas.openxmlformats.org/drawingml/2006/wordprocessingDrawing" xmlns:w10="urn:schemas-microsoft-com:office:word" xmlns:w="http://schemas.openxmlformats.org/wordprocessingml/2006/main" xmlns:w14="http://schemas.microsoft.com/office/word/2010/wordml" xmlns:w15="http://schemas.microsoft.com/office/word/2012/wordml" xmlns:w16cex="http://schemas.microsoft.com/office/word/2018/wordml/cex" xmlns:w16cid="http://schemas.microsoft.com/office/word/2016/wordml/cid" xmlns:w16="http://schemas.microsoft.com/office/word/2018/wordml" xmlns:w16du="http://schemas.microsoft.com/office/word/2023/wordml/word16du" xmlns:w16sdtdh="http://schemas.microsoft.com/office/word/2020/wordml/sdtdatahash" xmlns:w16sdtfl="http://schemas.microsoft.com/office/word/2024/wordml/sdtformatlock" xmlns:w16se="http://schemas.microsoft.com/office/word/2015/wordml/symex" xmlns:wpg="http://schemas.microsoft.com/office/word/2010/wordprocessingGroup" xmlns:wpi="http://schemas.microsoft.com/office/word/2010/wordprocessingInk" xmlns:wne="http://schemas.microsoft.com/office/word/2006/wordml" xmlns:wps="http://schemas.microsoft.com/office/word/2010/wordprocessingShape" mc:Ignorable="w14 w15 w16se w16cid w16 w16cex w16sdtdh w16sdtfl w16du wp14">
   <w:sdt>
     <w:sdtPr>
       <w:id w:val="26225908"/>
@@ -17308,7 +16443,7 @@
 </file>
 
 <file path=word/numbering.xml><?xml version="1.0" encoding="utf-8"?>
-<w:numbering xmlns:wpc="http://schemas.microsoft.com/office/word/2010/wordprocessingCanvas" xmlns:cx="http://schemas.microsoft.com/office/drawing/2014/chartex" xmlns:cx1="http://schemas.microsoft.com/office/drawing/2015/9/8/chartex" xmlns:cx2="http://schemas.microsoft.com/office/drawing/2015/10/21/chartex" xmlns:cx3="http://schemas.microsoft.com/office/drawing/2016/5/9/chartex" xmlns:cx4="http://schemas.microsoft.com/office/drawing/2016/5/10/chartex" xmlns:cx5="http://schemas.microsoft.com/office/drawing/2016/5/11/chartex" xmlns:cx6="http://schemas.microsoft.com/office/drawing/2016/5/12/chartex" xmlns:cx7="http://schemas.microsoft.com/office/drawing/2016/5/13/chartex" xmlns:cx8="http://schemas.microsoft.com/office/drawing/2016/5/14/chartex" xmlns:mc="http://schemas.openxmlformats.org/markup-compatibility/2006" xmlns:aink="http://schemas.microsoft.com/office/drawing/2016/ink" xmlns:am3d="http://schemas.microsoft.com/office/drawing/2017/model3d" xmlns:o="urn:schemas-microsoft-com:office:office" xmlns:r="http://schemas.openxmlformats.org/officeDocument/2006/relationships" xmlns:m="http://schemas.openxmlformats.org/officeDocument/2006/math" xmlns:v="urn:schemas-microsoft-com:vml" xmlns:wp14="http://schemas.microsoft.com/office/word/2010/wordprocessingDrawing" xmlns:wp="http://schemas.openxmlformats.org/drawingml/2006/wordprocessingDrawing" xmlns:w10="urn:schemas-microsoft-com:office:word" xmlns:w="http://schemas.openxmlformats.org/wordprocessingml/2006/main" xmlns:w14="http://schemas.microsoft.com/office/word/2010/wordml" xmlns:w15="http://schemas.microsoft.com/office/word/2012/wordml" xmlns:w16cex="http://schemas.microsoft.com/office/word/2018/wordml/cex" xmlns:w16cid="http://schemas.microsoft.com/office/word/2016/wordml/cid" xmlns:w16="http://schemas.microsoft.com/office/word/2018/wordml" xmlns:w16se="http://schemas.microsoft.com/office/word/2015/wordml/symex" xmlns:wpg="http://schemas.microsoft.com/office/word/2010/wordprocessingGroup" xmlns:wpi="http://schemas.microsoft.com/office/word/2010/wordprocessingInk" xmlns:wne="http://schemas.microsoft.com/office/word/2006/wordml" xmlns:wps="http://schemas.microsoft.com/office/word/2010/wordprocessingShape" mc:Ignorable="w14 w15 w16se w16cid w16 w16cex wp14">
+<w:numbering xmlns:wpc="http://schemas.microsoft.com/office/word/2010/wordprocessingCanvas" xmlns:cx="http://schemas.microsoft.com/office/drawing/2014/chartex" xmlns:cx1="http://schemas.microsoft.com/office/drawing/2015/9/8/chartex" xmlns:cx2="http://schemas.microsoft.com/office/drawing/2015/10/21/chartex" xmlns:cx3="http://schemas.microsoft.com/office/drawing/2016/5/9/chartex" xmlns:cx4="http://schemas.microsoft.com/office/drawing/2016/5/10/chartex" xmlns:cx5="http://schemas.microsoft.com/office/drawing/2016/5/11/chartex" xmlns:cx6="http://schemas.microsoft.com/office/drawing/2016/5/12/chartex" xmlns:cx7="http://schemas.microsoft.com/office/drawing/2016/5/13/chartex" xmlns:cx8="http://schemas.microsoft.com/office/drawing/2016/5/14/chartex" xmlns:mc="http://schemas.openxmlformats.org/markup-compatibility/2006" xmlns:aink="http://schemas.microsoft.com/office/drawing/2016/ink" xmlns:am3d="http://schemas.microsoft.com/office/drawing/2017/model3d" xmlns:o="urn:schemas-microsoft-com:office:office" xmlns:oel="http://schemas.microsoft.com/office/2019/extlst" xmlns:r="http://schemas.openxmlformats.org/officeDocument/2006/relationships" xmlns:m="http://schemas.openxmlformats.org/officeDocument/2006/math" xmlns:v="urn:schemas-microsoft-com:vml" xmlns:wp14="http://schemas.microsoft.com/office/word/2010/wordprocessingDrawing" xmlns:wp="http://schemas.openxmlformats.org/drawingml/2006/wordprocessingDrawing" xmlns:w10="urn:schemas-microsoft-com:office:word" xmlns:w="http://schemas.openxmlformats.org/wordprocessingml/2006/main" xmlns:w14="http://schemas.microsoft.com/office/word/2010/wordml" xmlns:w15="http://schemas.microsoft.com/office/word/2012/wordml" xmlns:w16cex="http://schemas.microsoft.com/office/word/2018/wordml/cex" xmlns:w16cid="http://schemas.microsoft.com/office/word/2016/wordml/cid" xmlns:w16="http://schemas.microsoft.com/office/word/2018/wordml" xmlns:w16du="http://schemas.microsoft.com/office/word/2023/wordml/word16du" xmlns:w16sdtdh="http://schemas.microsoft.com/office/word/2020/wordml/sdtdatahash" xmlns:w16sdtfl="http://schemas.microsoft.com/office/word/2024/wordml/sdtformatlock" xmlns:w16se="http://schemas.microsoft.com/office/word/2015/wordml/symex" xmlns:wpg="http://schemas.microsoft.com/office/word/2010/wordprocessingGroup" xmlns:wpi="http://schemas.microsoft.com/office/word/2010/wordprocessingInk" xmlns:wne="http://schemas.microsoft.com/office/word/2006/wordml" xmlns:wps="http://schemas.microsoft.com/office/word/2010/wordprocessingShape" mc:Ignorable="w14 w15 w16se w16cid w16 w16cex w16sdtdh w16sdtfl w16du wp14">
   <w:abstractNum w:abstractNumId="0" w15:restartNumberingAfterBreak="0">
     <w:nsid w:val="00000001"/>
     <w:multiLevelType w:val="multilevel"/>
@@ -20789,106 +19924,106 @@
       </w:pPr>
     </w:lvl>
   </w:abstractNum>
-  <w:num w:numId="1">
+  <w:num w:numId="1" w16cid:durableId="302001330">
     <w:abstractNumId w:val="7"/>
   </w:num>
-  <w:num w:numId="2">
+  <w:num w:numId="2" w16cid:durableId="1681470683">
     <w:abstractNumId w:val="31"/>
   </w:num>
-  <w:num w:numId="3">
+  <w:num w:numId="3" w16cid:durableId="1963800489">
     <w:abstractNumId w:val="27"/>
   </w:num>
-  <w:num w:numId="4">
+  <w:num w:numId="4" w16cid:durableId="151258649">
     <w:abstractNumId w:val="19"/>
   </w:num>
-  <w:num w:numId="5">
+  <w:num w:numId="5" w16cid:durableId="193469286">
     <w:abstractNumId w:val="25"/>
   </w:num>
-  <w:num w:numId="6">
+  <w:num w:numId="6" w16cid:durableId="874998838">
     <w:abstractNumId w:val="14"/>
   </w:num>
-  <w:num w:numId="7">
+  <w:num w:numId="7" w16cid:durableId="2018071306">
     <w:abstractNumId w:val="17"/>
   </w:num>
-  <w:num w:numId="8">
+  <w:num w:numId="8" w16cid:durableId="207229104">
     <w:abstractNumId w:val="12"/>
   </w:num>
-  <w:num w:numId="9">
+  <w:num w:numId="9" w16cid:durableId="1341355323">
     <w:abstractNumId w:val="26"/>
   </w:num>
-  <w:num w:numId="10">
+  <w:num w:numId="10" w16cid:durableId="1327434886">
     <w:abstractNumId w:val="23"/>
   </w:num>
-  <w:num w:numId="11">
+  <w:num w:numId="11" w16cid:durableId="1126236323">
     <w:abstractNumId w:val="13"/>
   </w:num>
-  <w:num w:numId="12">
+  <w:num w:numId="12" w16cid:durableId="223106851">
     <w:abstractNumId w:val="22"/>
   </w:num>
-  <w:num w:numId="13">
+  <w:num w:numId="13" w16cid:durableId="1601797569">
     <w:abstractNumId w:val="4"/>
   </w:num>
-  <w:num w:numId="14">
+  <w:num w:numId="14" w16cid:durableId="379599539">
     <w:abstractNumId w:val="16"/>
   </w:num>
-  <w:num w:numId="15">
+  <w:num w:numId="15" w16cid:durableId="914164418">
     <w:abstractNumId w:val="24"/>
   </w:num>
-  <w:num w:numId="16">
+  <w:num w:numId="16" w16cid:durableId="853954692">
     <w:abstractNumId w:val="8"/>
   </w:num>
-  <w:num w:numId="17">
+  <w:num w:numId="17" w16cid:durableId="1045254997">
     <w:abstractNumId w:val="29"/>
   </w:num>
-  <w:num w:numId="18">
+  <w:num w:numId="18" w16cid:durableId="1115558990">
     <w:abstractNumId w:val="32"/>
   </w:num>
-  <w:num w:numId="19">
+  <w:num w:numId="19" w16cid:durableId="203055751">
     <w:abstractNumId w:val="6"/>
   </w:num>
-  <w:num w:numId="20">
+  <w:num w:numId="20" w16cid:durableId="1932354225">
     <w:abstractNumId w:val="3"/>
   </w:num>
-  <w:num w:numId="21">
+  <w:num w:numId="21" w16cid:durableId="331219549">
     <w:abstractNumId w:val="34"/>
   </w:num>
-  <w:num w:numId="22">
+  <w:num w:numId="22" w16cid:durableId="869151274">
     <w:abstractNumId w:val="28"/>
   </w:num>
-  <w:num w:numId="23">
+  <w:num w:numId="23" w16cid:durableId="699277633">
     <w:abstractNumId w:val="30"/>
   </w:num>
-  <w:num w:numId="24">
+  <w:num w:numId="24" w16cid:durableId="1657224264">
     <w:abstractNumId w:val="5"/>
   </w:num>
-  <w:num w:numId="25">
+  <w:num w:numId="25" w16cid:durableId="2078739758">
     <w:abstractNumId w:val="20"/>
   </w:num>
-  <w:num w:numId="26">
+  <w:num w:numId="26" w16cid:durableId="37972134">
     <w:abstractNumId w:val="9"/>
   </w:num>
-  <w:num w:numId="27">
+  <w:num w:numId="27" w16cid:durableId="1359548874">
     <w:abstractNumId w:val="18"/>
   </w:num>
-  <w:num w:numId="28">
+  <w:num w:numId="28" w16cid:durableId="2001807697">
     <w:abstractNumId w:val="11"/>
   </w:num>
-  <w:num w:numId="29">
+  <w:num w:numId="29" w16cid:durableId="1066298169">
     <w:abstractNumId w:val="21"/>
   </w:num>
-  <w:num w:numId="30">
+  <w:num w:numId="30" w16cid:durableId="1945965163">
     <w:abstractNumId w:val="10"/>
   </w:num>
-  <w:num w:numId="31">
+  <w:num w:numId="31" w16cid:durableId="1097557480">
     <w:abstractNumId w:val="0"/>
   </w:num>
-  <w:num w:numId="32">
+  <w:num w:numId="32" w16cid:durableId="1925609214">
     <w:abstractNumId w:val="33"/>
   </w:num>
-  <w:num w:numId="33">
+  <w:num w:numId="33" w16cid:durableId="1498230228">
     <w:abstractNumId w:val="2"/>
   </w:num>
-  <w:num w:numId="34">
+  <w:num w:numId="34" w16cid:durableId="781538436">
     <w:abstractNumId w:val="15"/>
   </w:num>
   <w:numIdMacAtCleanup w:val="7"/>
@@ -20896,7 +20031,7 @@
 </file>
 
 <file path=word/styles.xml><?xml version="1.0" encoding="utf-8"?>
-<w:styles xmlns:mc="http://schemas.openxmlformats.org/markup-compatibility/2006" xmlns:r="http://schemas.openxmlformats.org/officeDocument/2006/relationships" xmlns:w="http://schemas.openxmlformats.org/wordprocessingml/2006/main" xmlns:w14="http://schemas.microsoft.com/office/word/2010/wordml" xmlns:w15="http://schemas.microsoft.com/office/word/2012/wordml" xmlns:w16cex="http://schemas.microsoft.com/office/word/2018/wordml/cex" xmlns:w16cid="http://schemas.microsoft.com/office/word/2016/wordml/cid" xmlns:w16="http://schemas.microsoft.com/office/word/2018/wordml" xmlns:w16se="http://schemas.microsoft.com/office/word/2015/wordml/symex" mc:Ignorable="w14 w15 w16se w16cid w16 w16cex">
+<w:styles xmlns:mc="http://schemas.openxmlformats.org/markup-compatibility/2006" xmlns:r="http://schemas.openxmlformats.org/officeDocument/2006/relationships" xmlns:w="http://schemas.openxmlformats.org/wordprocessingml/2006/main" xmlns:w14="http://schemas.microsoft.com/office/word/2010/wordml" xmlns:w15="http://schemas.microsoft.com/office/word/2012/wordml" xmlns:w16cex="http://schemas.microsoft.com/office/word/2018/wordml/cex" xmlns:w16cid="http://schemas.microsoft.com/office/word/2016/wordml/cid" xmlns:w16="http://schemas.microsoft.com/office/word/2018/wordml" xmlns:w16du="http://schemas.microsoft.com/office/word/2023/wordml/word16du" xmlns:w16sdtdh="http://schemas.microsoft.com/office/word/2020/wordml/sdtdatahash" xmlns:w16sdtfl="http://schemas.microsoft.com/office/word/2024/wordml/sdtformatlock" xmlns:w16se="http://schemas.microsoft.com/office/word/2015/wordml/symex" mc:Ignorable="w14 w15 w16se w16cid w16 w16cex w16sdtdh w16sdtfl w16du">
   <w:docDefaults>
     <w:rPrDefault>
       <w:rPr>
@@ -21347,6 +20482,7 @@
     <w:name w:val="heading 3"/>
     <w:basedOn w:val="Normal"/>
     <w:next w:val="Corpodetexto"/>
+    <w:link w:val="Ttulo3Char"/>
     <w:qFormat/>
     <w:pPr>
       <w:numPr>
@@ -22316,6 +21452,20 @@
       <w:iCs/>
     </w:rPr>
   </w:style>
+  <w:style w:type="character" w:customStyle="1" w:styleId="Ttulo3Char">
+    <w:name w:val="Título 3 Char"/>
+    <w:basedOn w:val="Fontepargpadro"/>
+    <w:link w:val="Ttulo3"/>
+    <w:rsid w:val="00513A7A"/>
+    <w:rPr>
+      <w:rFonts w:eastAsia="SimSun"/>
+      <w:b/>
+      <w:bCs/>
+      <w:sz w:val="27"/>
+      <w:szCs w:val="27"/>
+      <w:lang w:eastAsia="ar-SA"/>
+    </w:rPr>
+  </w:style>
 </w:styles>
 </file>
 
@@ -22615,6 +21765,35 @@
 </file>
 
 <file path=customXml/item1.xml><?xml version="1.0" encoding="utf-8"?>
+<?mso-contentType ?>
+<FormTemplates xmlns="http://schemas.microsoft.com/sharepoint/v3/contenttype/forms">
+  <Display>DocumentLibraryForm</Display>
+  <Edit>DocumentLibraryForm</Edit>
+  <New>DocumentLibraryForm</New>
+</FormTemplates>
+</file>
+
+<file path=customXml/item2.xml><?xml version="1.0" encoding="utf-8"?>
+<b:Sources xmlns:b="http://schemas.openxmlformats.org/officeDocument/2006/bibliography" xmlns="http://schemas.openxmlformats.org/officeDocument/2006/bibliography" SelectedStyle="\APA.XSL" StyleName="APA"/>
+</file>
+
+<file path=customXml/item3.xml><?xml version="1.0" encoding="utf-8"?>
+<LongProperties xmlns="http://schemas.microsoft.com/office/2006/metadata/longProperties"/>
+</file>
+
+<file path=customXml/item4.xml><?xml version="1.0" encoding="utf-8"?>
+<p:properties xmlns:p="http://schemas.microsoft.com/office/2006/metadata/properties" xmlns:xsi="http://www.w3.org/2001/XMLSchema-instance" xmlns:pc="http://schemas.microsoft.com/office/infopath/2007/PartnerControls">
+  <documentManagement>
+    <ReferenceId xmlns="880a620c-eb7a-428b-8529-de4d3fcc5197" xsi:nil="true"/>
+    <TaxCatchAll xmlns="1fc98a71-4ceb-4b6d-9be3-876a4489d33d" xsi:nil="true"/>
+    <lcf76f155ced4ddcb4097134ff3c332f xmlns="880a620c-eb7a-428b-8529-de4d3fcc5197">
+      <Terms xmlns="http://schemas.microsoft.com/office/infopath/2007/PartnerControls"/>
+    </lcf76f155ced4ddcb4097134ff3c332f>
+  </documentManagement>
+</p:properties>
+</file>
+
+<file path=customXml/item5.xml><?xml version="1.0" encoding="utf-8"?>
 <ct:contentTypeSchema xmlns:ct="http://schemas.microsoft.com/office/2006/metadata/contentType" xmlns:ma="http://schemas.microsoft.com/office/2006/metadata/properties/metaAttributes" ct:_="" ma:_="" ma:contentTypeName="Document" ma:contentTypeID="0x0101007347F5FE40A9E6498A66577D799B1DEC" ma:contentTypeVersion="12" ma:contentTypeDescription="Create a new document." ma:contentTypeScope="" ma:versionID="5f14a144fb02b1f3ee90a9041cc68994">
   <xsd:schema xmlns:xsd="http://www.w3.org/2001/XMLSchema" xmlns:xs="http://www.w3.org/2001/XMLSchema" xmlns:p="http://schemas.microsoft.com/office/2006/metadata/properties" xmlns:ns2="880a620c-eb7a-428b-8529-de4d3fcc5197" xmlns:ns3="1fc98a71-4ceb-4b6d-9be3-876a4489d33d" targetNamespace="http://schemas.microsoft.com/office/2006/metadata/properties" ma:root="true" ma:fieldsID="4aef813d42305c051ff3d6d12c5b32bb" ns2:_="" ns3:_="">
     <xsd:import namespace="880a620c-eb7a-428b-8529-de4d3fcc5197"/>
@@ -22815,36 +21994,42 @@
 </ct:contentTypeSchema>
 </file>
 
-<file path=customXml/item2.xml><?xml version="1.0" encoding="utf-8"?>
-<?mso-contentType ?>
-<FormTemplates xmlns="http://schemas.microsoft.com/sharepoint/v3/contenttype/forms">
-  <Display>DocumentLibraryForm</Display>
-  <Edit>DocumentLibraryForm</Edit>
-  <New>DocumentLibraryForm</New>
-</FormTemplates>
+<file path=customXml/itemProps1.xml><?xml version="1.0" encoding="utf-8"?>
+<ds:datastoreItem xmlns:ds="http://schemas.openxmlformats.org/officeDocument/2006/customXml" ds:itemID="{209482B3-65DB-4C31-8741-89208C0CA6EE}">
+  <ds:schemaRefs>
+    <ds:schemaRef ds:uri="http://schemas.microsoft.com/sharepoint/v3/contenttype/forms"/>
+  </ds:schemaRefs>
+</ds:datastoreItem>
 </file>
 
-<file path=customXml/item3.xml><?xml version="1.0" encoding="utf-8"?>
-<p:properties xmlns:p="http://schemas.microsoft.com/office/2006/metadata/properties" xmlns:xsi="http://www.w3.org/2001/XMLSchema-instance" xmlns:pc="http://schemas.microsoft.com/office/infopath/2007/PartnerControls">
-  <documentManagement>
-    <ReferenceId xmlns="880a620c-eb7a-428b-8529-de4d3fcc5197" xsi:nil="true"/>
-    <TaxCatchAll xmlns="1fc98a71-4ceb-4b6d-9be3-876a4489d33d" xsi:nil="true"/>
-    <lcf76f155ced4ddcb4097134ff3c332f xmlns="880a620c-eb7a-428b-8529-de4d3fcc5197">
-      <Terms xmlns="http://schemas.microsoft.com/office/infopath/2007/PartnerControls"/>
-    </lcf76f155ced4ddcb4097134ff3c332f>
-  </documentManagement>
-</p:properties>
+<file path=customXml/itemProps2.xml><?xml version="1.0" encoding="utf-8"?>
+<ds:datastoreItem xmlns:ds="http://schemas.openxmlformats.org/officeDocument/2006/customXml" ds:itemID="{22B70F82-2C6D-41E8-B8F7-0700079E7E32}">
+  <ds:schemaRefs>
+    <ds:schemaRef ds:uri="http://schemas.openxmlformats.org/officeDocument/2006/bibliography"/>
+  </ds:schemaRefs>
+</ds:datastoreItem>
 </file>
 
-<file path=customXml/item4.xml><?xml version="1.0" encoding="utf-8"?>
-<LongProperties xmlns="http://schemas.microsoft.com/office/2006/metadata/longProperties"/>
+<file path=customXml/itemProps3.xml><?xml version="1.0" encoding="utf-8"?>
+<ds:datastoreItem xmlns:ds="http://schemas.openxmlformats.org/officeDocument/2006/customXml" ds:itemID="{16AA62FC-C7F7-4444-92F3-4F71969E5D5D}">
+  <ds:schemaRefs>
+    <ds:schemaRef ds:uri="http://schemas.microsoft.com/office/2006/metadata/longProperties"/>
+  </ds:schemaRefs>
+</ds:datastoreItem>
 </file>
 
-<file path=customXml/item5.xml><?xml version="1.0" encoding="utf-8"?>
-<b:Sources xmlns:b="http://schemas.openxmlformats.org/officeDocument/2006/bibliography" xmlns="http://schemas.openxmlformats.org/officeDocument/2006/bibliography" SelectedStyle="\APA.XSL" StyleName="APA"/>
+<file path=customXml/itemProps4.xml><?xml version="1.0" encoding="utf-8"?>
+<ds:datastoreItem xmlns:ds="http://schemas.openxmlformats.org/officeDocument/2006/customXml" ds:itemID="{4855FF90-E7A1-4C87-9E2C-581F8B8E2C23}">
+  <ds:schemaRefs>
+    <ds:schemaRef ds:uri="http://schemas.microsoft.com/office/2006/metadata/properties"/>
+    <ds:schemaRef ds:uri="http://schemas.microsoft.com/office/infopath/2007/PartnerControls"/>
+    <ds:schemaRef ds:uri="880a620c-eb7a-428b-8529-de4d3fcc5197"/>
+    <ds:schemaRef ds:uri="1fc98a71-4ceb-4b6d-9be3-876a4489d33d"/>
+  </ds:schemaRefs>
+</ds:datastoreItem>
 </file>
 
-<file path=customXml/itemProps1.xml><?xml version="1.0" encoding="utf-8"?>
+<file path=customXml/itemProps5.xml><?xml version="1.0" encoding="utf-8"?>
 <ds:datastoreItem xmlns:ds="http://schemas.openxmlformats.org/officeDocument/2006/customXml" ds:itemID="{A2FA4BFD-B43E-460A-8895-97DDFCE292EB}">
   <ds:schemaRefs>
     <ds:schemaRef ds:uri="http://schemas.microsoft.com/office/2006/metadata/contentType"/>
@@ -22861,39 +22046,4 @@
     <ds:schemaRef ds:uri="http://schemas.microsoft.com/internal/obd"/>
   </ds:schemaRefs>
 </ds:datastoreItem>
-</file>
-
-<file path=customXml/itemProps2.xml><?xml version="1.0" encoding="utf-8"?>
-<ds:datastoreItem xmlns:ds="http://schemas.openxmlformats.org/officeDocument/2006/customXml" ds:itemID="{209482B3-65DB-4C31-8741-89208C0CA6EE}">
-  <ds:schemaRefs>
-    <ds:schemaRef ds:uri="http://schemas.microsoft.com/sharepoint/v3/contenttype/forms"/>
-  </ds:schemaRefs>
-</ds:datastoreItem>
-</file>
-
-<file path=customXml/itemProps3.xml><?xml version="1.0" encoding="utf-8"?>
-<ds:datastoreItem xmlns:ds="http://schemas.openxmlformats.org/officeDocument/2006/customXml" ds:itemID="{4855FF90-E7A1-4C87-9E2C-581F8B8E2C23}">
-  <ds:schemaRefs>
-    <ds:schemaRef ds:uri="http://schemas.microsoft.com/office/2006/metadata/properties"/>
-    <ds:schemaRef ds:uri="http://schemas.microsoft.com/office/infopath/2007/PartnerControls"/>
-    <ds:schemaRef ds:uri="880a620c-eb7a-428b-8529-de4d3fcc5197"/>
-    <ds:schemaRef ds:uri="1fc98a71-4ceb-4b6d-9be3-876a4489d33d"/>
-  </ds:schemaRefs>
-</ds:datastoreItem>
-</file>
-
-<file path=customXml/itemProps4.xml><?xml version="1.0" encoding="utf-8"?>
-<ds:datastoreItem xmlns:ds="http://schemas.openxmlformats.org/officeDocument/2006/customXml" ds:itemID="{16AA62FC-C7F7-4444-92F3-4F71969E5D5D}">
-  <ds:schemaRefs>
-    <ds:schemaRef ds:uri="http://schemas.microsoft.com/office/2006/metadata/longProperties"/>
-  </ds:schemaRefs>
-</ds:datastoreItem>
-</file>
-
-<file path=customXml/itemProps5.xml><?xml version="1.0" encoding="utf-8"?>
-<ds:datastoreItem xmlns:ds="http://schemas.openxmlformats.org/officeDocument/2006/customXml" ds:itemID="{22B70F82-2C6D-41E8-B8F7-0700079E7E32}">
-  <ds:schemaRefs>
-    <ds:schemaRef ds:uri="http://schemas.openxmlformats.org/officeDocument/2006/bibliography"/>
-  </ds:schemaRefs>
-</ds:datastoreItem>
 </file>
</xml_diff>